<commit_message>
Modificación de R.F.2 Y R.F.3
</commit_message>
<xml_diff>
--- a/docs/Requerimientos-Totales.docx
+++ b/docs/Requerimientos-Totales.docx
@@ -204,7 +204,6 @@
         <w:tc>
           <w:tcPr>
             <w:tcW w:w="2100" w:type="dxa"/>
-            <w:shd w:val="clear" w:color="auto" w:fill="auto"/>
             <w:tcMar>
               <w:top w:w="100" w:type="dxa"/>
               <w:left w:w="100" w:type="dxa"/>
@@ -233,7 +232,6 @@
           <w:tcPr>
             <w:tcW w:w="3165" w:type="dxa"/>
             <w:gridSpan w:val="2"/>
-            <w:shd w:val="clear" w:color="auto" w:fill="auto"/>
             <w:tcMar>
               <w:top w:w="100" w:type="dxa"/>
               <w:left w:w="100" w:type="dxa"/>
@@ -262,7 +260,6 @@
         <w:tc>
           <w:tcPr>
             <w:tcW w:w="1965" w:type="dxa"/>
-            <w:shd w:val="clear" w:color="auto" w:fill="auto"/>
             <w:tcMar>
               <w:top w:w="100" w:type="dxa"/>
               <w:left w:w="100" w:type="dxa"/>
@@ -290,7 +287,6 @@
         <w:tc>
           <w:tcPr>
             <w:tcW w:w="2385" w:type="dxa"/>
-            <w:shd w:val="clear" w:color="auto" w:fill="auto"/>
             <w:tcMar>
               <w:top w:w="100" w:type="dxa"/>
               <w:left w:w="100" w:type="dxa"/>
@@ -358,7 +354,6 @@
           <w:tcPr>
             <w:tcW w:w="7515" w:type="dxa"/>
             <w:gridSpan w:val="4"/>
-            <w:shd w:val="clear" w:color="auto" w:fill="auto"/>
             <w:tcMar>
               <w:top w:w="100" w:type="dxa"/>
               <w:left w:w="100" w:type="dxa"/>
@@ -560,7 +555,6 @@
         <w:tc>
           <w:tcPr>
             <w:tcW w:w="2100" w:type="dxa"/>
-            <w:shd w:val="clear" w:color="auto" w:fill="auto"/>
             <w:tcMar>
               <w:top w:w="100" w:type="dxa"/>
               <w:left w:w="100" w:type="dxa"/>
@@ -612,7 +606,6 @@
         <w:tc>
           <w:tcPr>
             <w:tcW w:w="1650" w:type="dxa"/>
-            <w:shd w:val="clear" w:color="auto" w:fill="auto"/>
             <w:tcMar>
               <w:top w:w="100" w:type="dxa"/>
               <w:left w:w="100" w:type="dxa"/>
@@ -653,7 +646,6 @@
         <w:tc>
           <w:tcPr>
             <w:tcW w:w="1515" w:type="dxa"/>
-            <w:shd w:val="clear" w:color="auto" w:fill="auto"/>
             <w:tcMar>
               <w:top w:w="100" w:type="dxa"/>
               <w:left w:w="100" w:type="dxa"/>
@@ -703,7 +695,6 @@
         <w:tc>
           <w:tcPr>
             <w:tcW w:w="1965" w:type="dxa"/>
-            <w:shd w:val="clear" w:color="auto" w:fill="auto"/>
             <w:tcMar>
               <w:top w:w="100" w:type="dxa"/>
               <w:left w:w="100" w:type="dxa"/>
@@ -731,7 +722,6 @@
         <w:tc>
           <w:tcPr>
             <w:tcW w:w="2385" w:type="dxa"/>
-            <w:shd w:val="clear" w:color="auto" w:fill="auto"/>
             <w:tcMar>
               <w:top w:w="100" w:type="dxa"/>
               <w:left w:w="100" w:type="dxa"/>
@@ -799,7 +789,6 @@
           <w:tcPr>
             <w:tcW w:w="7515" w:type="dxa"/>
             <w:gridSpan w:val="4"/>
-            <w:shd w:val="clear" w:color="auto" w:fill="auto"/>
             <w:tcMar>
               <w:top w:w="100" w:type="dxa"/>
               <w:left w:w="100" w:type="dxa"/>
@@ -1002,7 +991,6 @@
           <w:tcPr>
             <w:tcW w:w="7515" w:type="dxa"/>
             <w:gridSpan w:val="4"/>
-            <w:shd w:val="clear" w:color="auto" w:fill="auto"/>
             <w:tcMar>
               <w:top w:w="100" w:type="dxa"/>
               <w:left w:w="100" w:type="dxa"/>
@@ -1218,7 +1206,6 @@
         <w:tc>
           <w:tcPr>
             <w:tcW w:w="2258" w:type="dxa"/>
-            <w:shd w:val="clear" w:color="auto" w:fill="auto"/>
             <w:tcMar>
               <w:top w:w="100" w:type="dxa"/>
               <w:left w:w="100" w:type="dxa"/>
@@ -1240,7 +1227,6 @@
           <w:tcPr>
             <w:tcW w:w="3007" w:type="dxa"/>
             <w:gridSpan w:val="2"/>
-            <w:shd w:val="clear" w:color="auto" w:fill="auto"/>
             <w:tcMar>
               <w:top w:w="100" w:type="dxa"/>
               <w:left w:w="100" w:type="dxa"/>
@@ -1268,7 +1254,6 @@
         <w:tc>
           <w:tcPr>
             <w:tcW w:w="1965" w:type="dxa"/>
-            <w:shd w:val="clear" w:color="auto" w:fill="auto"/>
             <w:tcMar>
               <w:top w:w="100" w:type="dxa"/>
               <w:left w:w="100" w:type="dxa"/>
@@ -1289,7 +1274,6 @@
         <w:tc>
           <w:tcPr>
             <w:tcW w:w="2385" w:type="dxa"/>
-            <w:shd w:val="clear" w:color="auto" w:fill="auto"/>
             <w:tcMar>
               <w:top w:w="100" w:type="dxa"/>
               <w:left w:w="100" w:type="dxa"/>
@@ -1343,7 +1327,6 @@
           <w:tcPr>
             <w:tcW w:w="7357" w:type="dxa"/>
             <w:gridSpan w:val="4"/>
-            <w:shd w:val="clear" w:color="auto" w:fill="auto"/>
             <w:tcMar>
               <w:top w:w="100" w:type="dxa"/>
               <w:left w:w="100" w:type="dxa"/>
@@ -1503,7 +1486,6 @@
         <w:tc>
           <w:tcPr>
             <w:tcW w:w="2258" w:type="dxa"/>
-            <w:shd w:val="clear" w:color="auto" w:fill="auto"/>
             <w:tcMar>
               <w:top w:w="100" w:type="dxa"/>
               <w:left w:w="100" w:type="dxa"/>
@@ -1612,21 +1594,28 @@
         <w:tc>
           <w:tcPr>
             <w:tcW w:w="1492" w:type="dxa"/>
-            <w:shd w:val="clear" w:color="auto" w:fill="auto"/>
-            <w:tcMar>
-              <w:top w:w="100" w:type="dxa"/>
-              <w:left w:w="100" w:type="dxa"/>
-              <w:bottom w:w="100" w:type="dxa"/>
-              <w:right w:w="100" w:type="dxa"/>
-            </w:tcMar>
-          </w:tcPr>
-          <w:p>
-            <w:pPr>
-              <w:widowControl w:val="0"/>
-              <w:spacing w:line="240" w:lineRule="auto"/>
-            </w:pPr>
-            <w:r>
-              <w:t>Usuario autenticado con permiso para registrar libros (Maestro, Directora o Root)</w:t>
+            <w:tcMar>
+              <w:top w:w="100" w:type="dxa"/>
+              <w:left w:w="100" w:type="dxa"/>
+              <w:bottom w:w="100" w:type="dxa"/>
+              <w:right w:w="100" w:type="dxa"/>
+            </w:tcMar>
+          </w:tcPr>
+          <w:p>
+            <w:pPr>
+              <w:widowControl w:val="0"/>
+              <w:spacing w:line="240" w:lineRule="auto"/>
+            </w:pPr>
+            <w:r>
+              <w:t xml:space="preserve">Usuario autenticado con permiso para registrar libros (Maestro, </w:t>
+            </w:r>
+            <w:proofErr w:type="gramStart"/>
+            <w:r>
+              <w:t>Directora</w:t>
+            </w:r>
+            <w:proofErr w:type="gramEnd"/>
+            <w:r>
+              <w:t xml:space="preserve"> o Root)</w:t>
             </w:r>
           </w:p>
           <w:p>
@@ -1651,7 +1640,6 @@
         <w:tc>
           <w:tcPr>
             <w:tcW w:w="1515" w:type="dxa"/>
-            <w:shd w:val="clear" w:color="auto" w:fill="auto"/>
             <w:tcMar>
               <w:top w:w="100" w:type="dxa"/>
               <w:left w:w="100" w:type="dxa"/>
@@ -1672,7 +1660,6 @@
         <w:tc>
           <w:tcPr>
             <w:tcW w:w="1965" w:type="dxa"/>
-            <w:shd w:val="clear" w:color="auto" w:fill="auto"/>
             <w:tcMar>
               <w:top w:w="100" w:type="dxa"/>
               <w:left w:w="100" w:type="dxa"/>
@@ -1693,7 +1680,6 @@
         <w:tc>
           <w:tcPr>
             <w:tcW w:w="2385" w:type="dxa"/>
-            <w:shd w:val="clear" w:color="auto" w:fill="auto"/>
             <w:tcMar>
               <w:top w:w="100" w:type="dxa"/>
               <w:left w:w="100" w:type="dxa"/>
@@ -1741,6 +1727,20 @@
             </w:pPr>
             <w:r>
               <w:t>ISBN puede ir N/A</w:t>
+            </w:r>
+          </w:p>
+          <w:p>
+            <w:pPr>
+              <w:pStyle w:val="Prrafodelista"/>
+              <w:widowControl w:val="0"/>
+              <w:numPr>
+                <w:ilvl w:val="0"/>
+                <w:numId w:val="7"/>
+              </w:numPr>
+              <w:spacing w:line="240" w:lineRule="auto"/>
+            </w:pPr>
+            <w:r>
+              <w:t>Si no hay conexión a internet o el NER no identifica los datos, los campos deben habilitarse para entrada manual obligatoria</w:t>
             </w:r>
           </w:p>
         </w:tc>
@@ -1780,7 +1780,6 @@
           <w:tcPr>
             <w:tcW w:w="7357" w:type="dxa"/>
             <w:gridSpan w:val="4"/>
-            <w:shd w:val="clear" w:color="auto" w:fill="auto"/>
             <w:tcMar>
               <w:top w:w="100" w:type="dxa"/>
               <w:left w:w="100" w:type="dxa"/>
@@ -1802,7 +1801,27 @@
               <w:t>E</w:t>
             </w:r>
             <w:r>
-              <w:t>l usuario ingresa los datos del libro</w:t>
+              <w:t xml:space="preserve">l usuario ingresa los datos del </w:t>
+            </w:r>
+            <w:proofErr w:type="gramStart"/>
+            <w:r>
+              <w:t>libro</w:t>
+            </w:r>
+            <w:r>
+              <w:t>(</w:t>
+            </w:r>
+            <w:proofErr w:type="gramEnd"/>
+            <w:r>
+              <w:t xml:space="preserve">ISBN) o </w:t>
+            </w:r>
+            <w:r>
+              <w:t xml:space="preserve">escanea </w:t>
+            </w:r>
+            <w:r>
+              <w:t xml:space="preserve">el </w:t>
+            </w:r>
+            <w:r>
+              <w:t>código de barras</w:t>
             </w:r>
           </w:p>
           <w:p>
@@ -1816,7 +1835,52 @@
               <w:spacing w:line="240" w:lineRule="auto"/>
             </w:pPr>
             <w:r>
-              <w:t>Presiona el botón “Agregar Libro#</w:t>
+              <w:t>El sistema consulta fuentes externas y ejecuta el modelo NER para extraer Autor, Título y Editorial.</w:t>
+            </w:r>
+          </w:p>
+          <w:p>
+            <w:pPr>
+              <w:pStyle w:val="Prrafodelista"/>
+              <w:widowControl w:val="0"/>
+              <w:numPr>
+                <w:ilvl w:val="0"/>
+                <w:numId w:val="6"/>
+              </w:numPr>
+              <w:spacing w:line="240" w:lineRule="auto"/>
+            </w:pPr>
+            <w:r>
+              <w:t>Presiona el botón “Agregar Libro</w:t>
+            </w:r>
+            <w:r>
+              <w:t>”</w:t>
+            </w:r>
+          </w:p>
+          <w:p>
+            <w:pPr>
+              <w:pStyle w:val="Prrafodelista"/>
+              <w:widowControl w:val="0"/>
+              <w:numPr>
+                <w:ilvl w:val="0"/>
+                <w:numId w:val="6"/>
+              </w:numPr>
+              <w:spacing w:line="240" w:lineRule="auto"/>
+            </w:pPr>
+            <w:r>
+              <w:t>El sistema autocompleta los campos en la interfaz con la información extraída.</w:t>
+            </w:r>
+          </w:p>
+          <w:p>
+            <w:pPr>
+              <w:pStyle w:val="Prrafodelista"/>
+              <w:widowControl w:val="0"/>
+              <w:numPr>
+                <w:ilvl w:val="0"/>
+                <w:numId w:val="6"/>
+              </w:numPr>
+              <w:spacing w:line="240" w:lineRule="auto"/>
+            </w:pPr>
+            <w:r>
+              <w:t>El usuario verifica, corrige si es necesario y confirma el registro.</w:t>
             </w:r>
           </w:p>
           <w:p>
@@ -1918,7 +1982,6 @@
           <w:tcPr>
             <w:tcW w:w="7357" w:type="dxa"/>
             <w:gridSpan w:val="4"/>
-            <w:shd w:val="clear" w:color="auto" w:fill="auto"/>
             <w:tcMar>
               <w:top w:w="100" w:type="dxa"/>
               <w:left w:w="100" w:type="dxa"/>
@@ -1940,8 +2003,1032 @@
       <w:bookmarkEnd w:id="1"/>
     </w:tbl>
     <w:p/>
+    <w:tbl>
+      <w:tblPr>
+        <w:tblStyle w:val="1"/>
+        <w:tblW w:w="9615" w:type="dxa"/>
+        <w:tblInd w:w="0" w:type="dxa"/>
+        <w:tblBorders>
+          <w:top w:val="single" w:sz="8" w:space="0" w:color="000000"/>
+          <w:left w:val="single" w:sz="8" w:space="0" w:color="000000"/>
+          <w:bottom w:val="single" w:sz="8" w:space="0" w:color="000000"/>
+          <w:right w:val="single" w:sz="8" w:space="0" w:color="000000"/>
+          <w:insideH w:val="single" w:sz="8" w:space="0" w:color="000000"/>
+          <w:insideV w:val="single" w:sz="8" w:space="0" w:color="000000"/>
+        </w:tblBorders>
+        <w:tblLayout w:type="fixed"/>
+        <w:tblLook w:val="0600" w:firstRow="0" w:lastRow="0" w:firstColumn="0" w:lastColumn="0" w:noHBand="1" w:noVBand="1"/>
+      </w:tblPr>
+      <w:tblGrid>
+        <w:gridCol w:w="2100"/>
+        <w:gridCol w:w="1650"/>
+        <w:gridCol w:w="1515"/>
+        <w:gridCol w:w="1965"/>
+        <w:gridCol w:w="2385"/>
+      </w:tblGrid>
+      <w:tr>
+        <w:trPr>
+          <w:trHeight w:val="420"/>
+        </w:trPr>
+        <w:tc>
+          <w:tcPr>
+            <w:tcW w:w="9615" w:type="dxa"/>
+            <w:gridSpan w:val="5"/>
+            <w:shd w:val="clear" w:color="auto" w:fill="D9D9D9"/>
+            <w:tcMar>
+              <w:top w:w="100" w:type="dxa"/>
+              <w:left w:w="100" w:type="dxa"/>
+              <w:bottom w:w="100" w:type="dxa"/>
+              <w:right w:w="100" w:type="dxa"/>
+            </w:tcMar>
+          </w:tcPr>
+          <w:p>
+            <w:pPr>
+              <w:widowControl w:val="0"/>
+              <w:spacing w:line="240" w:lineRule="auto"/>
+              <w:jc w:val="center"/>
+              <w:rPr>
+                <w:b/>
+              </w:rPr>
+            </w:pPr>
+            <w:bookmarkStart w:id="2" w:name="_Hlk202910760"/>
+            <w:r>
+              <w:rPr>
+                <w:b/>
+              </w:rPr>
+              <w:lastRenderedPageBreak/>
+              <w:t>Especificación de requerimientos</w:t>
+            </w:r>
+          </w:p>
+        </w:tc>
+      </w:tr>
+      <w:tr>
+        <w:trPr>
+          <w:trHeight w:val="420"/>
+        </w:trPr>
+        <w:tc>
+          <w:tcPr>
+            <w:tcW w:w="2100" w:type="dxa"/>
+            <w:shd w:val="clear" w:color="auto" w:fill="D9D9D9"/>
+            <w:tcMar>
+              <w:top w:w="100" w:type="dxa"/>
+              <w:left w:w="100" w:type="dxa"/>
+              <w:bottom w:w="100" w:type="dxa"/>
+              <w:right w:w="100" w:type="dxa"/>
+            </w:tcMar>
+          </w:tcPr>
+          <w:p>
+            <w:pPr>
+              <w:widowControl w:val="0"/>
+              <w:spacing w:line="240" w:lineRule="auto"/>
+              <w:rPr>
+                <w:b/>
+              </w:rPr>
+            </w:pPr>
+            <w:r>
+              <w:rPr>
+                <w:b/>
+              </w:rPr>
+              <w:t>Código</w:t>
+            </w:r>
+          </w:p>
+        </w:tc>
+        <w:tc>
+          <w:tcPr>
+            <w:tcW w:w="3165" w:type="dxa"/>
+            <w:gridSpan w:val="2"/>
+            <w:shd w:val="clear" w:color="auto" w:fill="D9D9D9"/>
+            <w:tcMar>
+              <w:top w:w="100" w:type="dxa"/>
+              <w:left w:w="100" w:type="dxa"/>
+              <w:bottom w:w="100" w:type="dxa"/>
+              <w:right w:w="100" w:type="dxa"/>
+            </w:tcMar>
+          </w:tcPr>
+          <w:p>
+            <w:pPr>
+              <w:widowControl w:val="0"/>
+              <w:spacing w:line="240" w:lineRule="auto"/>
+              <w:jc w:val="center"/>
+              <w:rPr>
+                <w:b/>
+              </w:rPr>
+            </w:pPr>
+            <w:r>
+              <w:rPr>
+                <w:b/>
+              </w:rPr>
+              <w:t>Nombre</w:t>
+            </w:r>
+          </w:p>
+        </w:tc>
+        <w:tc>
+          <w:tcPr>
+            <w:tcW w:w="1965" w:type="dxa"/>
+            <w:shd w:val="clear" w:color="auto" w:fill="D9D9D9"/>
+            <w:tcMar>
+              <w:top w:w="100" w:type="dxa"/>
+              <w:left w:w="100" w:type="dxa"/>
+              <w:bottom w:w="100" w:type="dxa"/>
+              <w:right w:w="100" w:type="dxa"/>
+            </w:tcMar>
+          </w:tcPr>
+          <w:p>
+            <w:pPr>
+              <w:widowControl w:val="0"/>
+              <w:spacing w:line="240" w:lineRule="auto"/>
+              <w:rPr>
+                <w:b/>
+              </w:rPr>
+            </w:pPr>
+            <w:r>
+              <w:rPr>
+                <w:b/>
+              </w:rPr>
+              <w:t>Fecha</w:t>
+            </w:r>
+          </w:p>
+        </w:tc>
+        <w:tc>
+          <w:tcPr>
+            <w:tcW w:w="2385" w:type="dxa"/>
+            <w:shd w:val="clear" w:color="auto" w:fill="D9D9D9"/>
+            <w:tcMar>
+              <w:top w:w="100" w:type="dxa"/>
+              <w:left w:w="100" w:type="dxa"/>
+              <w:bottom w:w="100" w:type="dxa"/>
+              <w:right w:w="100" w:type="dxa"/>
+            </w:tcMar>
+          </w:tcPr>
+          <w:p>
+            <w:pPr>
+              <w:widowControl w:val="0"/>
+              <w:spacing w:line="240" w:lineRule="auto"/>
+              <w:rPr>
+                <w:b/>
+              </w:rPr>
+            </w:pPr>
+            <w:r>
+              <w:rPr>
+                <w:b/>
+              </w:rPr>
+              <w:t>Grado de necesidad</w:t>
+            </w:r>
+          </w:p>
+        </w:tc>
+      </w:tr>
+      <w:tr>
+        <w:trPr>
+          <w:trHeight w:val="447"/>
+        </w:trPr>
+        <w:tc>
+          <w:tcPr>
+            <w:tcW w:w="2100" w:type="dxa"/>
+            <w:tcMar>
+              <w:top w:w="100" w:type="dxa"/>
+              <w:left w:w="100" w:type="dxa"/>
+              <w:bottom w:w="100" w:type="dxa"/>
+              <w:right w:w="100" w:type="dxa"/>
+            </w:tcMar>
+          </w:tcPr>
+          <w:p>
+            <w:pPr>
+              <w:widowControl w:val="0"/>
+              <w:spacing w:line="240" w:lineRule="auto"/>
+            </w:pPr>
+            <w:r>
+              <w:t>R.F.3</w:t>
+            </w:r>
+          </w:p>
+        </w:tc>
+        <w:tc>
+          <w:tcPr>
+            <w:tcW w:w="3165" w:type="dxa"/>
+            <w:gridSpan w:val="2"/>
+            <w:tcMar>
+              <w:top w:w="100" w:type="dxa"/>
+              <w:left w:w="100" w:type="dxa"/>
+              <w:bottom w:w="100" w:type="dxa"/>
+              <w:right w:w="100" w:type="dxa"/>
+            </w:tcMar>
+          </w:tcPr>
+          <w:p>
+            <w:pPr>
+              <w:widowControl w:val="0"/>
+              <w:spacing w:line="240" w:lineRule="auto"/>
+              <w:jc w:val="center"/>
+            </w:pPr>
+            <w:r>
+              <w:t xml:space="preserve">Registrar </w:t>
+            </w:r>
+            <w:r>
+              <w:t>p</w:t>
+            </w:r>
+            <w:r>
+              <w:t>réstamo</w:t>
+            </w:r>
+          </w:p>
+        </w:tc>
+        <w:tc>
+          <w:tcPr>
+            <w:tcW w:w="1965" w:type="dxa"/>
+            <w:tcMar>
+              <w:top w:w="100" w:type="dxa"/>
+              <w:left w:w="100" w:type="dxa"/>
+              <w:bottom w:w="100" w:type="dxa"/>
+              <w:right w:w="100" w:type="dxa"/>
+            </w:tcMar>
+          </w:tcPr>
+          <w:p>
+            <w:pPr>
+              <w:widowControl w:val="0"/>
+              <w:spacing w:line="240" w:lineRule="auto"/>
+            </w:pPr>
+            <w:r>
+              <w:t>05/07/2025</w:t>
+            </w:r>
+          </w:p>
+        </w:tc>
+        <w:tc>
+          <w:tcPr>
+            <w:tcW w:w="2385" w:type="dxa"/>
+            <w:tcMar>
+              <w:top w:w="100" w:type="dxa"/>
+              <w:left w:w="100" w:type="dxa"/>
+              <w:bottom w:w="100" w:type="dxa"/>
+              <w:right w:w="100" w:type="dxa"/>
+            </w:tcMar>
+          </w:tcPr>
+          <w:p>
+            <w:pPr>
+              <w:widowControl w:val="0"/>
+              <w:spacing w:line="240" w:lineRule="auto"/>
+            </w:pPr>
+            <w:r>
+              <w:t>Necesaria</w:t>
+            </w:r>
+          </w:p>
+        </w:tc>
+      </w:tr>
+      <w:tr>
+        <w:trPr>
+          <w:trHeight w:val="420"/>
+        </w:trPr>
+        <w:tc>
+          <w:tcPr>
+            <w:tcW w:w="2100" w:type="dxa"/>
+            <w:shd w:val="clear" w:color="auto" w:fill="D9D9D9"/>
+            <w:tcMar>
+              <w:top w:w="100" w:type="dxa"/>
+              <w:left w:w="100" w:type="dxa"/>
+              <w:bottom w:w="100" w:type="dxa"/>
+              <w:right w:w="100" w:type="dxa"/>
+            </w:tcMar>
+          </w:tcPr>
+          <w:p>
+            <w:pPr>
+              <w:widowControl w:val="0"/>
+              <w:spacing w:line="240" w:lineRule="auto"/>
+              <w:rPr>
+                <w:b/>
+              </w:rPr>
+            </w:pPr>
+            <w:r>
+              <w:rPr>
+                <w:b/>
+              </w:rPr>
+              <w:t>Descripción</w:t>
+            </w:r>
+          </w:p>
+        </w:tc>
+        <w:tc>
+          <w:tcPr>
+            <w:tcW w:w="7515" w:type="dxa"/>
+            <w:gridSpan w:val="4"/>
+            <w:tcMar>
+              <w:top w:w="100" w:type="dxa"/>
+              <w:left w:w="100" w:type="dxa"/>
+              <w:bottom w:w="100" w:type="dxa"/>
+              <w:right w:w="100" w:type="dxa"/>
+            </w:tcMar>
+          </w:tcPr>
+          <w:p>
+            <w:pPr>
+              <w:widowControl w:val="0"/>
+              <w:spacing w:line="240" w:lineRule="auto"/>
+            </w:pPr>
+            <w:r>
+              <w:t>Permite registra</w:t>
+            </w:r>
+            <w:r>
+              <w:t>r</w:t>
+            </w:r>
+            <w:r>
+              <w:t xml:space="preserve"> el préstamo de uno o más libros a un alumno que se encuentre activo en el sistema, asociándolo al maestro responsable</w:t>
+            </w:r>
+          </w:p>
+        </w:tc>
+      </w:tr>
+      <w:tr>
+        <w:tc>
+          <w:tcPr>
+            <w:tcW w:w="2100" w:type="dxa"/>
+            <w:shd w:val="clear" w:color="auto" w:fill="D9D9D9"/>
+            <w:tcMar>
+              <w:top w:w="100" w:type="dxa"/>
+              <w:left w:w="100" w:type="dxa"/>
+              <w:bottom w:w="100" w:type="dxa"/>
+              <w:right w:w="100" w:type="dxa"/>
+            </w:tcMar>
+          </w:tcPr>
+          <w:p>
+            <w:pPr>
+              <w:widowControl w:val="0"/>
+              <w:spacing w:line="240" w:lineRule="auto"/>
+              <w:rPr>
+                <w:b/>
+              </w:rPr>
+            </w:pPr>
+            <w:r>
+              <w:rPr>
+                <w:b/>
+              </w:rPr>
+              <w:t>Entradas</w:t>
+            </w:r>
+          </w:p>
+        </w:tc>
+        <w:tc>
+          <w:tcPr>
+            <w:tcW w:w="1650" w:type="dxa"/>
+            <w:shd w:val="clear" w:color="auto" w:fill="D9D9D9"/>
+            <w:tcMar>
+              <w:top w:w="100" w:type="dxa"/>
+              <w:left w:w="100" w:type="dxa"/>
+              <w:bottom w:w="100" w:type="dxa"/>
+              <w:right w:w="100" w:type="dxa"/>
+            </w:tcMar>
+          </w:tcPr>
+          <w:p>
+            <w:pPr>
+              <w:widowControl w:val="0"/>
+              <w:spacing w:line="240" w:lineRule="auto"/>
+              <w:rPr>
+                <w:b/>
+              </w:rPr>
+            </w:pPr>
+            <w:r>
+              <w:rPr>
+                <w:b/>
+              </w:rPr>
+              <w:t>Fuente</w:t>
+            </w:r>
+          </w:p>
+        </w:tc>
+        <w:tc>
+          <w:tcPr>
+            <w:tcW w:w="1515" w:type="dxa"/>
+            <w:shd w:val="clear" w:color="auto" w:fill="D9D9D9"/>
+            <w:tcMar>
+              <w:top w:w="100" w:type="dxa"/>
+              <w:left w:w="100" w:type="dxa"/>
+              <w:bottom w:w="100" w:type="dxa"/>
+              <w:right w:w="100" w:type="dxa"/>
+            </w:tcMar>
+          </w:tcPr>
+          <w:p>
+            <w:pPr>
+              <w:widowControl w:val="0"/>
+              <w:spacing w:line="240" w:lineRule="auto"/>
+              <w:rPr>
+                <w:b/>
+              </w:rPr>
+            </w:pPr>
+            <w:r>
+              <w:rPr>
+                <w:b/>
+              </w:rPr>
+              <w:t>Salida</w:t>
+            </w:r>
+          </w:p>
+        </w:tc>
+        <w:tc>
+          <w:tcPr>
+            <w:tcW w:w="1965" w:type="dxa"/>
+            <w:shd w:val="clear" w:color="auto" w:fill="D9D9D9"/>
+            <w:tcMar>
+              <w:top w:w="100" w:type="dxa"/>
+              <w:left w:w="100" w:type="dxa"/>
+              <w:bottom w:w="100" w:type="dxa"/>
+              <w:right w:w="100" w:type="dxa"/>
+            </w:tcMar>
+          </w:tcPr>
+          <w:p>
+            <w:pPr>
+              <w:widowControl w:val="0"/>
+              <w:spacing w:line="240" w:lineRule="auto"/>
+              <w:rPr>
+                <w:b/>
+              </w:rPr>
+            </w:pPr>
+            <w:r>
+              <w:rPr>
+                <w:b/>
+              </w:rPr>
+              <w:t>Destino</w:t>
+            </w:r>
+          </w:p>
+        </w:tc>
+        <w:tc>
+          <w:tcPr>
+            <w:tcW w:w="2385" w:type="dxa"/>
+            <w:shd w:val="clear" w:color="auto" w:fill="D9D9D9"/>
+            <w:tcMar>
+              <w:top w:w="100" w:type="dxa"/>
+              <w:left w:w="100" w:type="dxa"/>
+              <w:bottom w:w="100" w:type="dxa"/>
+              <w:right w:w="100" w:type="dxa"/>
+            </w:tcMar>
+          </w:tcPr>
+          <w:p>
+            <w:pPr>
+              <w:widowControl w:val="0"/>
+              <w:spacing w:line="240" w:lineRule="auto"/>
+              <w:rPr>
+                <w:b/>
+              </w:rPr>
+            </w:pPr>
+            <w:r>
+              <w:rPr>
+                <w:b/>
+              </w:rPr>
+              <w:t>Restricciones</w:t>
+            </w:r>
+          </w:p>
+        </w:tc>
+      </w:tr>
+      <w:tr>
+        <w:tc>
+          <w:tcPr>
+            <w:tcW w:w="2100" w:type="dxa"/>
+            <w:tcMar>
+              <w:top w:w="100" w:type="dxa"/>
+              <w:left w:w="100" w:type="dxa"/>
+              <w:bottom w:w="100" w:type="dxa"/>
+              <w:right w:w="100" w:type="dxa"/>
+            </w:tcMar>
+          </w:tcPr>
+          <w:p>
+            <w:pPr>
+              <w:widowControl w:val="0"/>
+              <w:numPr>
+                <w:ilvl w:val="0"/>
+                <w:numId w:val="1"/>
+              </w:numPr>
+              <w:spacing w:line="240" w:lineRule="auto"/>
+            </w:pPr>
+            <w:r>
+              <w:t>Selección de alumno</w:t>
+            </w:r>
+          </w:p>
+          <w:p>
+            <w:pPr>
+              <w:widowControl w:val="0"/>
+              <w:numPr>
+                <w:ilvl w:val="0"/>
+                <w:numId w:val="1"/>
+              </w:numPr>
+              <w:spacing w:line="240" w:lineRule="auto"/>
+            </w:pPr>
+            <w:r>
+              <w:t>Selección de libro disponible</w:t>
+            </w:r>
+          </w:p>
+          <w:p>
+            <w:pPr>
+              <w:widowControl w:val="0"/>
+              <w:numPr>
+                <w:ilvl w:val="0"/>
+                <w:numId w:val="1"/>
+              </w:numPr>
+              <w:spacing w:line="240" w:lineRule="auto"/>
+            </w:pPr>
+            <w:r>
+              <w:t>Fecha estimada de devolución</w:t>
+            </w:r>
+          </w:p>
+        </w:tc>
+        <w:tc>
+          <w:tcPr>
+            <w:tcW w:w="1650" w:type="dxa"/>
+            <w:tcMar>
+              <w:top w:w="100" w:type="dxa"/>
+              <w:left w:w="100" w:type="dxa"/>
+              <w:bottom w:w="100" w:type="dxa"/>
+              <w:right w:w="100" w:type="dxa"/>
+            </w:tcMar>
+          </w:tcPr>
+          <w:p>
+            <w:pPr>
+              <w:widowControl w:val="0"/>
+              <w:spacing w:line="240" w:lineRule="auto"/>
+            </w:pPr>
+            <w:r>
+              <w:t>Maestro/</w:t>
+            </w:r>
+            <w:proofErr w:type="gramStart"/>
+            <w:r>
+              <w:t>Directora</w:t>
+            </w:r>
+            <w:proofErr w:type="gramEnd"/>
+            <w:r>
+              <w:t xml:space="preserve"> autenticado con permiso de préstamo</w:t>
+            </w:r>
+          </w:p>
+        </w:tc>
+        <w:tc>
+          <w:tcPr>
+            <w:tcW w:w="1515" w:type="dxa"/>
+            <w:tcMar>
+              <w:top w:w="100" w:type="dxa"/>
+              <w:left w:w="100" w:type="dxa"/>
+              <w:bottom w:w="100" w:type="dxa"/>
+              <w:right w:w="100" w:type="dxa"/>
+            </w:tcMar>
+          </w:tcPr>
+          <w:p>
+            <w:pPr>
+              <w:widowControl w:val="0"/>
+              <w:spacing w:line="240" w:lineRule="auto"/>
+            </w:pPr>
+            <w:r>
+              <w:t>Mensaje de confirmación o error en pantalla.</w:t>
+            </w:r>
+          </w:p>
+          <w:p>
+            <w:pPr>
+              <w:widowControl w:val="0"/>
+              <w:spacing w:line="240" w:lineRule="auto"/>
+            </w:pPr>
+          </w:p>
+          <w:p>
+            <w:pPr>
+              <w:widowControl w:val="0"/>
+              <w:spacing w:line="240" w:lineRule="auto"/>
+            </w:pPr>
+            <w:r>
+              <w:t>Actualización del inventario del libro</w:t>
+            </w:r>
+          </w:p>
+          <w:p>
+            <w:pPr>
+              <w:widowControl w:val="0"/>
+              <w:spacing w:line="240" w:lineRule="auto"/>
+            </w:pPr>
+          </w:p>
+          <w:p>
+            <w:pPr>
+              <w:widowControl w:val="0"/>
+              <w:spacing w:line="240" w:lineRule="auto"/>
+            </w:pPr>
+            <w:r>
+              <w:t>Registro en tabla prestamos</w:t>
+            </w:r>
+          </w:p>
+        </w:tc>
+        <w:tc>
+          <w:tcPr>
+            <w:tcW w:w="1965" w:type="dxa"/>
+            <w:tcMar>
+              <w:top w:w="100" w:type="dxa"/>
+              <w:left w:w="100" w:type="dxa"/>
+              <w:bottom w:w="100" w:type="dxa"/>
+              <w:right w:w="100" w:type="dxa"/>
+            </w:tcMar>
+          </w:tcPr>
+          <w:p>
+            <w:pPr>
+              <w:widowControl w:val="0"/>
+              <w:spacing w:line="240" w:lineRule="auto"/>
+            </w:pPr>
+            <w:r>
+              <w:t>Interfaz gráfica</w:t>
+            </w:r>
+          </w:p>
+          <w:p>
+            <w:pPr>
+              <w:widowControl w:val="0"/>
+              <w:spacing w:line="240" w:lineRule="auto"/>
+            </w:pPr>
+          </w:p>
+          <w:p>
+            <w:pPr>
+              <w:widowControl w:val="0"/>
+              <w:spacing w:line="240" w:lineRule="auto"/>
+            </w:pPr>
+            <w:r>
+              <w:t xml:space="preserve">Tabla prestamos, </w:t>
+            </w:r>
+            <w:proofErr w:type="spellStart"/>
+            <w:r>
+              <w:t>detalle_prestamos</w:t>
+            </w:r>
+            <w:proofErr w:type="spellEnd"/>
+            <w:r>
+              <w:t xml:space="preserve"> y actualización de la tabla libros</w:t>
+            </w:r>
+          </w:p>
+        </w:tc>
+        <w:tc>
+          <w:tcPr>
+            <w:tcW w:w="2385" w:type="dxa"/>
+            <w:tcMar>
+              <w:top w:w="100" w:type="dxa"/>
+              <w:left w:w="100" w:type="dxa"/>
+              <w:bottom w:w="100" w:type="dxa"/>
+              <w:right w:w="100" w:type="dxa"/>
+            </w:tcMar>
+          </w:tcPr>
+          <w:p>
+            <w:pPr>
+              <w:pStyle w:val="Prrafodelista"/>
+              <w:widowControl w:val="0"/>
+              <w:numPr>
+                <w:ilvl w:val="0"/>
+                <w:numId w:val="11"/>
+              </w:numPr>
+              <w:spacing w:line="240" w:lineRule="auto"/>
+            </w:pPr>
+            <w:r>
+              <w:t>El alumno debe estar activo</w:t>
+            </w:r>
+          </w:p>
+          <w:p>
+            <w:pPr>
+              <w:pStyle w:val="Prrafodelista"/>
+              <w:widowControl w:val="0"/>
+              <w:numPr>
+                <w:ilvl w:val="0"/>
+                <w:numId w:val="11"/>
+              </w:numPr>
+              <w:spacing w:line="240" w:lineRule="auto"/>
+            </w:pPr>
+            <w:r>
+              <w:t>El usuario debe tener permiso para registrar un préstamo</w:t>
+            </w:r>
+          </w:p>
+          <w:p>
+            <w:pPr>
+              <w:pStyle w:val="Prrafodelista"/>
+              <w:widowControl w:val="0"/>
+              <w:numPr>
+                <w:ilvl w:val="0"/>
+                <w:numId w:val="11"/>
+              </w:numPr>
+              <w:spacing w:line="240" w:lineRule="auto"/>
+            </w:pPr>
+            <w:r>
+              <w:t>Debe haber al menos un libro seleccionado y con copias disponibles</w:t>
+            </w:r>
+          </w:p>
+          <w:p>
+            <w:pPr>
+              <w:pStyle w:val="Prrafodelista"/>
+              <w:widowControl w:val="0"/>
+              <w:numPr>
+                <w:ilvl w:val="0"/>
+                <w:numId w:val="11"/>
+              </w:numPr>
+              <w:spacing w:line="240" w:lineRule="auto"/>
+            </w:pPr>
+            <w:r>
+              <w:t>Fecha de devolución debe estar definida</w:t>
+            </w:r>
+          </w:p>
+          <w:p>
+            <w:pPr>
+              <w:widowControl w:val="0"/>
+              <w:spacing w:line="240" w:lineRule="auto"/>
+            </w:pPr>
+          </w:p>
+          <w:p>
+            <w:pPr>
+              <w:widowControl w:val="0"/>
+              <w:spacing w:line="240" w:lineRule="auto"/>
+            </w:pPr>
+          </w:p>
+        </w:tc>
+      </w:tr>
+      <w:tr>
+        <w:trPr>
+          <w:trHeight w:val="420"/>
+        </w:trPr>
+        <w:tc>
+          <w:tcPr>
+            <w:tcW w:w="2100" w:type="dxa"/>
+            <w:shd w:val="clear" w:color="auto" w:fill="D9D9D9"/>
+            <w:tcMar>
+              <w:top w:w="100" w:type="dxa"/>
+              <w:left w:w="100" w:type="dxa"/>
+              <w:bottom w:w="100" w:type="dxa"/>
+              <w:right w:w="100" w:type="dxa"/>
+            </w:tcMar>
+          </w:tcPr>
+          <w:p>
+            <w:pPr>
+              <w:widowControl w:val="0"/>
+              <w:spacing w:line="240" w:lineRule="auto"/>
+              <w:rPr>
+                <w:b/>
+              </w:rPr>
+            </w:pPr>
+            <w:r>
+              <w:rPr>
+                <w:b/>
+              </w:rPr>
+              <w:t>Proceso</w:t>
+            </w:r>
+          </w:p>
+        </w:tc>
+        <w:tc>
+          <w:tcPr>
+            <w:tcW w:w="7515" w:type="dxa"/>
+            <w:gridSpan w:val="4"/>
+            <w:tcMar>
+              <w:top w:w="100" w:type="dxa"/>
+              <w:left w:w="100" w:type="dxa"/>
+              <w:bottom w:w="100" w:type="dxa"/>
+              <w:right w:w="100" w:type="dxa"/>
+            </w:tcMar>
+          </w:tcPr>
+          <w:p>
+            <w:pPr>
+              <w:pStyle w:val="Prrafodelista"/>
+              <w:widowControl w:val="0"/>
+              <w:numPr>
+                <w:ilvl w:val="0"/>
+                <w:numId w:val="12"/>
+              </w:numPr>
+              <w:spacing w:line="240" w:lineRule="auto"/>
+            </w:pPr>
+            <w:r>
+              <w:t>El usuario inicia sesión</w:t>
+            </w:r>
+          </w:p>
+          <w:p>
+            <w:pPr>
+              <w:pStyle w:val="Prrafodelista"/>
+              <w:widowControl w:val="0"/>
+              <w:numPr>
+                <w:ilvl w:val="0"/>
+                <w:numId w:val="12"/>
+              </w:numPr>
+              <w:spacing w:line="240" w:lineRule="auto"/>
+            </w:pPr>
+            <w:r>
+              <w:t xml:space="preserve">Accede a la sección de prestamos </w:t>
+            </w:r>
+          </w:p>
+          <w:p>
+            <w:pPr>
+              <w:pStyle w:val="Prrafodelista"/>
+              <w:widowControl w:val="0"/>
+              <w:numPr>
+                <w:ilvl w:val="0"/>
+                <w:numId w:val="12"/>
+              </w:numPr>
+              <w:spacing w:line="240" w:lineRule="auto"/>
+            </w:pPr>
+            <w:r>
+              <w:t>Da clic en el botón “Nuevo préstamo”</w:t>
+            </w:r>
+          </w:p>
+          <w:p>
+            <w:pPr>
+              <w:pStyle w:val="Prrafodelista"/>
+              <w:widowControl w:val="0"/>
+              <w:numPr>
+                <w:ilvl w:val="0"/>
+                <w:numId w:val="12"/>
+              </w:numPr>
+              <w:spacing w:line="240" w:lineRule="auto"/>
+            </w:pPr>
+            <w:r>
+              <w:t>El usuario comienza a escribir el nombre del alumno en el campo de búsqueda.</w:t>
+            </w:r>
+          </w:p>
+          <w:p>
+            <w:pPr>
+              <w:pStyle w:val="Prrafodelista"/>
+              <w:widowControl w:val="0"/>
+              <w:numPr>
+                <w:ilvl w:val="0"/>
+                <w:numId w:val="12"/>
+              </w:numPr>
+              <w:spacing w:line="240" w:lineRule="auto"/>
+            </w:pPr>
+            <w:r>
+              <w:t>El sistema realiza una búsqueda difusa (</w:t>
+            </w:r>
+            <w:proofErr w:type="spellStart"/>
+            <w:r>
+              <w:t>Fuzzy</w:t>
+            </w:r>
+            <w:proofErr w:type="spellEnd"/>
+            <w:r>
+              <w:t xml:space="preserve"> Search) comparando la entrada con la base de datos de alumnos activos.</w:t>
+            </w:r>
+          </w:p>
+          <w:p>
+            <w:pPr>
+              <w:pStyle w:val="Prrafodelista"/>
+              <w:widowControl w:val="0"/>
+              <w:numPr>
+                <w:ilvl w:val="0"/>
+                <w:numId w:val="12"/>
+              </w:numPr>
+              <w:spacing w:line="240" w:lineRule="auto"/>
+            </w:pPr>
+            <w:r>
+              <w:t>El sistema despliega una lista de coincidencias sugeridas basadas en similitud fonética o de caracteres.</w:t>
+            </w:r>
+          </w:p>
+          <w:p>
+            <w:pPr>
+              <w:pStyle w:val="Prrafodelista"/>
+              <w:widowControl w:val="0"/>
+              <w:numPr>
+                <w:ilvl w:val="0"/>
+                <w:numId w:val="12"/>
+              </w:numPr>
+              <w:spacing w:line="240" w:lineRule="auto"/>
+            </w:pPr>
+            <w:r>
+              <w:t>El usuario s</w:t>
+            </w:r>
+            <w:r>
+              <w:t>elecciona al alumno</w:t>
+            </w:r>
+          </w:p>
+          <w:p>
+            <w:pPr>
+              <w:pStyle w:val="Prrafodelista"/>
+              <w:widowControl w:val="0"/>
+              <w:numPr>
+                <w:ilvl w:val="0"/>
+                <w:numId w:val="12"/>
+              </w:numPr>
+              <w:spacing w:line="240" w:lineRule="auto"/>
+            </w:pPr>
+            <w:r>
+              <w:t>Selecciona uno o más libros con copias disponibles</w:t>
+            </w:r>
+          </w:p>
+          <w:p>
+            <w:pPr>
+              <w:pStyle w:val="Prrafodelista"/>
+              <w:widowControl w:val="0"/>
+              <w:numPr>
+                <w:ilvl w:val="0"/>
+                <w:numId w:val="12"/>
+              </w:numPr>
+              <w:spacing w:line="240" w:lineRule="auto"/>
+            </w:pPr>
+            <w:r>
+              <w:t>Indica fecha estimada de devolución</w:t>
+            </w:r>
+          </w:p>
+          <w:p>
+            <w:pPr>
+              <w:pStyle w:val="Prrafodelista"/>
+              <w:widowControl w:val="0"/>
+              <w:numPr>
+                <w:ilvl w:val="0"/>
+                <w:numId w:val="12"/>
+              </w:numPr>
+              <w:spacing w:line="240" w:lineRule="auto"/>
+            </w:pPr>
+            <w:r>
+              <w:t>Confirma el préstamo</w:t>
+            </w:r>
+          </w:p>
+          <w:p>
+            <w:pPr>
+              <w:pStyle w:val="Prrafodelista"/>
+              <w:widowControl w:val="0"/>
+              <w:numPr>
+                <w:ilvl w:val="0"/>
+                <w:numId w:val="12"/>
+              </w:numPr>
+              <w:spacing w:line="240" w:lineRule="auto"/>
+            </w:pPr>
+            <w:r>
+              <w:t>El sistema guarda el préstamo, reduce copias y muestra confirmación</w:t>
+            </w:r>
+          </w:p>
+        </w:tc>
+      </w:tr>
+      <w:tr>
+        <w:trPr>
+          <w:trHeight w:val="420"/>
+        </w:trPr>
+        <w:tc>
+          <w:tcPr>
+            <w:tcW w:w="2100" w:type="dxa"/>
+            <w:shd w:val="clear" w:color="auto" w:fill="D9D9D9"/>
+            <w:tcMar>
+              <w:top w:w="100" w:type="dxa"/>
+              <w:left w:w="100" w:type="dxa"/>
+              <w:bottom w:w="100" w:type="dxa"/>
+              <w:right w:w="100" w:type="dxa"/>
+            </w:tcMar>
+          </w:tcPr>
+          <w:p>
+            <w:pPr>
+              <w:widowControl w:val="0"/>
+              <w:spacing w:line="240" w:lineRule="auto"/>
+              <w:rPr>
+                <w:b/>
+              </w:rPr>
+            </w:pPr>
+            <w:r>
+              <w:rPr>
+                <w:b/>
+              </w:rPr>
+              <w:t>Efecto Colateral</w:t>
+            </w:r>
+          </w:p>
+        </w:tc>
+        <w:tc>
+          <w:tcPr>
+            <w:tcW w:w="7515" w:type="dxa"/>
+            <w:gridSpan w:val="4"/>
+            <w:tcMar>
+              <w:top w:w="100" w:type="dxa"/>
+              <w:left w:w="100" w:type="dxa"/>
+              <w:bottom w:w="100" w:type="dxa"/>
+              <w:right w:w="100" w:type="dxa"/>
+            </w:tcMar>
+          </w:tcPr>
+          <w:p>
+            <w:pPr>
+              <w:pStyle w:val="Prrafodelista"/>
+              <w:widowControl w:val="0"/>
+              <w:numPr>
+                <w:ilvl w:val="0"/>
+                <w:numId w:val="13"/>
+              </w:numPr>
+              <w:spacing w:line="240" w:lineRule="auto"/>
+            </w:pPr>
+            <w:r>
+              <w:t>Se reduce la cantidad de copias disponibles del libro</w:t>
+            </w:r>
+          </w:p>
+          <w:p>
+            <w:pPr>
+              <w:pStyle w:val="Prrafodelista"/>
+              <w:widowControl w:val="0"/>
+              <w:numPr>
+                <w:ilvl w:val="0"/>
+                <w:numId w:val="13"/>
+              </w:numPr>
+              <w:spacing w:line="240" w:lineRule="auto"/>
+            </w:pPr>
+            <w:r>
+              <w:t>Se crea una entrada en el historial de prestamos</w:t>
+            </w:r>
+          </w:p>
+          <w:p>
+            <w:pPr>
+              <w:pStyle w:val="Prrafodelista"/>
+              <w:widowControl w:val="0"/>
+              <w:numPr>
+                <w:ilvl w:val="0"/>
+                <w:numId w:val="13"/>
+              </w:numPr>
+              <w:spacing w:line="240" w:lineRule="auto"/>
+            </w:pPr>
+            <w:r>
+              <w:t xml:space="preserve">El préstamo queda vinculado al usuario que lo registró </w:t>
+            </w:r>
+          </w:p>
+        </w:tc>
+      </w:tr>
+      <w:bookmarkEnd w:id="2"/>
+    </w:tbl>
+    <w:p/>
+    <w:p>
+      <w:pPr>
+        <w:tabs>
+          <w:tab w:val="left" w:pos="1626"/>
+        </w:tabs>
+      </w:pPr>
+      <w:r>
+        <w:tab/>
+      </w:r>
+    </w:p>
     <w:p>
       <w:r>
+        <w:lastRenderedPageBreak/>
         <w:br w:type="page"/>
       </w:r>
     </w:p>
@@ -1993,7 +3080,7 @@
                 <w:b/>
               </w:rPr>
             </w:pPr>
-            <w:bookmarkStart w:id="2" w:name="_Hlk202910760"/>
+            <w:bookmarkStart w:id="3" w:name="_Hlk202910813"/>
             <w:r>
               <w:rPr>
                 <w:b/>
@@ -2126,21 +3213,20 @@
         <w:tc>
           <w:tcPr>
             <w:tcW w:w="2100" w:type="dxa"/>
-            <w:shd w:val="clear" w:color="auto" w:fill="auto"/>
-            <w:tcMar>
-              <w:top w:w="100" w:type="dxa"/>
-              <w:left w:w="100" w:type="dxa"/>
-              <w:bottom w:w="100" w:type="dxa"/>
-              <w:right w:w="100" w:type="dxa"/>
-            </w:tcMar>
-          </w:tcPr>
-          <w:p>
-            <w:pPr>
-              <w:widowControl w:val="0"/>
-              <w:spacing w:line="240" w:lineRule="auto"/>
-            </w:pPr>
-            <w:r>
-              <w:t>R.F.3</w:t>
+            <w:tcMar>
+              <w:top w:w="100" w:type="dxa"/>
+              <w:left w:w="100" w:type="dxa"/>
+              <w:bottom w:w="100" w:type="dxa"/>
+              <w:right w:w="100" w:type="dxa"/>
+            </w:tcMar>
+          </w:tcPr>
+          <w:p>
+            <w:pPr>
+              <w:widowControl w:val="0"/>
+              <w:spacing w:line="240" w:lineRule="auto"/>
+            </w:pPr>
+            <w:r>
+              <w:t>R.F.4</w:t>
             </w:r>
           </w:p>
         </w:tc>
@@ -2148,7 +3234,6 @@
           <w:tcPr>
             <w:tcW w:w="3165" w:type="dxa"/>
             <w:gridSpan w:val="2"/>
-            <w:shd w:val="clear" w:color="auto" w:fill="auto"/>
             <w:tcMar>
               <w:top w:w="100" w:type="dxa"/>
               <w:left w:w="100" w:type="dxa"/>
@@ -2163,20 +3248,13 @@
               <w:jc w:val="center"/>
             </w:pPr>
             <w:r>
-              <w:t xml:space="preserve">Registrar </w:t>
-            </w:r>
-            <w:r>
-              <w:t>p</w:t>
-            </w:r>
-            <w:r>
-              <w:t>réstamo</w:t>
+              <w:t>Registrar devolución</w:t>
             </w:r>
           </w:p>
         </w:tc>
         <w:tc>
           <w:tcPr>
             <w:tcW w:w="1965" w:type="dxa"/>
-            <w:shd w:val="clear" w:color="auto" w:fill="auto"/>
             <w:tcMar>
               <w:top w:w="100" w:type="dxa"/>
               <w:left w:w="100" w:type="dxa"/>
@@ -2197,7 +3275,6 @@
         <w:tc>
           <w:tcPr>
             <w:tcW w:w="2385" w:type="dxa"/>
-            <w:shd w:val="clear" w:color="auto" w:fill="auto"/>
             <w:tcMar>
               <w:top w:w="100" w:type="dxa"/>
               <w:left w:w="100" w:type="dxa"/>
@@ -2251,27 +3328,23 @@
           <w:tcPr>
             <w:tcW w:w="7515" w:type="dxa"/>
             <w:gridSpan w:val="4"/>
-            <w:shd w:val="clear" w:color="auto" w:fill="auto"/>
-            <w:tcMar>
-              <w:top w:w="100" w:type="dxa"/>
-              <w:left w:w="100" w:type="dxa"/>
-              <w:bottom w:w="100" w:type="dxa"/>
-              <w:right w:w="100" w:type="dxa"/>
-            </w:tcMar>
-          </w:tcPr>
-          <w:p>
-            <w:pPr>
-              <w:widowControl w:val="0"/>
-              <w:spacing w:line="240" w:lineRule="auto"/>
-            </w:pPr>
-            <w:r>
-              <w:t>Permite registra</w:t>
-            </w:r>
-            <w:r>
-              <w:t>r</w:t>
-            </w:r>
-            <w:r>
-              <w:t xml:space="preserve"> el préstamo de uno o más libros a un alumno que se encuentre activo en el sistema, asociándolo al maestro responsable</w:t>
+            <w:tcMar>
+              <w:top w:w="100" w:type="dxa"/>
+              <w:left w:w="100" w:type="dxa"/>
+              <w:bottom w:w="100" w:type="dxa"/>
+              <w:right w:w="100" w:type="dxa"/>
+            </w:tcMar>
+          </w:tcPr>
+          <w:p>
+            <w:pPr>
+              <w:widowControl w:val="0"/>
+              <w:spacing w:line="240" w:lineRule="auto"/>
+            </w:pPr>
+            <w:r>
+              <w:t>Permite re</w:t>
+            </w:r>
+            <w:r>
+              <w:t xml:space="preserve">gistrar la devolución de un préstamo de libro, para así poder volver a tener en inventario el libro devuelto </w:t>
             </w:r>
           </w:p>
         </w:tc>
@@ -2417,7 +3490,6 @@
         <w:tc>
           <w:tcPr>
             <w:tcW w:w="2100" w:type="dxa"/>
-            <w:shd w:val="clear" w:color="auto" w:fill="auto"/>
             <w:tcMar>
               <w:top w:w="100" w:type="dxa"/>
               <w:left w:w="100" w:type="dxa"/>
@@ -2435,209 +3507,182 @@
               <w:spacing w:line="240" w:lineRule="auto"/>
             </w:pPr>
             <w:r>
-              <w:t>Selección de alumno</w:t>
-            </w:r>
-          </w:p>
-          <w:p>
-            <w:pPr>
+              <w:t xml:space="preserve">Préstamo seleccionado </w:t>
+            </w:r>
+            <w:r>
+              <w:t xml:space="preserve"> </w:t>
+            </w:r>
+          </w:p>
+        </w:tc>
+        <w:tc>
+          <w:tcPr>
+            <w:tcW w:w="1650" w:type="dxa"/>
+            <w:tcMar>
+              <w:top w:w="100" w:type="dxa"/>
+              <w:left w:w="100" w:type="dxa"/>
+              <w:bottom w:w="100" w:type="dxa"/>
+              <w:right w:w="100" w:type="dxa"/>
+            </w:tcMar>
+          </w:tcPr>
+          <w:p>
+            <w:pPr>
+              <w:widowControl w:val="0"/>
+              <w:spacing w:line="240" w:lineRule="auto"/>
+            </w:pPr>
+            <w:r>
+              <w:t>Maestro/</w:t>
+            </w:r>
+            <w:proofErr w:type="gramStart"/>
+            <w:r>
+              <w:t>Directora</w:t>
+            </w:r>
+            <w:proofErr w:type="gramEnd"/>
+            <w:r>
+              <w:t xml:space="preserve"> autenticado con permiso de préstamo</w:t>
+            </w:r>
+          </w:p>
+        </w:tc>
+        <w:tc>
+          <w:tcPr>
+            <w:tcW w:w="1515" w:type="dxa"/>
+            <w:tcMar>
+              <w:top w:w="100" w:type="dxa"/>
+              <w:left w:w="100" w:type="dxa"/>
+              <w:bottom w:w="100" w:type="dxa"/>
+              <w:right w:w="100" w:type="dxa"/>
+            </w:tcMar>
+          </w:tcPr>
+          <w:p>
+            <w:pPr>
+              <w:widowControl w:val="0"/>
+              <w:spacing w:line="240" w:lineRule="auto"/>
+            </w:pPr>
+            <w:r>
+              <w:t>Mensaje de confirmación o error en pantalla.</w:t>
+            </w:r>
+          </w:p>
+          <w:p>
+            <w:pPr>
+              <w:widowControl w:val="0"/>
+              <w:spacing w:line="240" w:lineRule="auto"/>
+            </w:pPr>
+          </w:p>
+          <w:p>
+            <w:pPr>
+              <w:widowControl w:val="0"/>
+              <w:spacing w:line="240" w:lineRule="auto"/>
+            </w:pPr>
+            <w:r>
+              <w:t>Actualización del inventario del libro</w:t>
+            </w:r>
+          </w:p>
+          <w:p>
+            <w:pPr>
+              <w:widowControl w:val="0"/>
+              <w:spacing w:line="240" w:lineRule="auto"/>
+            </w:pPr>
+          </w:p>
+          <w:p>
+            <w:pPr>
+              <w:widowControl w:val="0"/>
+              <w:spacing w:line="240" w:lineRule="auto"/>
+            </w:pPr>
+            <w:r>
+              <w:t>Actualización</w:t>
+            </w:r>
+            <w:r>
+              <w:t xml:space="preserve"> en tabla prestamos</w:t>
+            </w:r>
+          </w:p>
+        </w:tc>
+        <w:tc>
+          <w:tcPr>
+            <w:tcW w:w="1965" w:type="dxa"/>
+            <w:tcMar>
+              <w:top w:w="100" w:type="dxa"/>
+              <w:left w:w="100" w:type="dxa"/>
+              <w:bottom w:w="100" w:type="dxa"/>
+              <w:right w:w="100" w:type="dxa"/>
+            </w:tcMar>
+          </w:tcPr>
+          <w:p>
+            <w:pPr>
+              <w:widowControl w:val="0"/>
+              <w:spacing w:line="240" w:lineRule="auto"/>
+            </w:pPr>
+            <w:r>
+              <w:t>Interfaz gráfica</w:t>
+            </w:r>
+          </w:p>
+          <w:p>
+            <w:pPr>
+              <w:widowControl w:val="0"/>
+              <w:spacing w:line="240" w:lineRule="auto"/>
+            </w:pPr>
+          </w:p>
+          <w:p>
+            <w:pPr>
+              <w:widowControl w:val="0"/>
+              <w:spacing w:line="240" w:lineRule="auto"/>
+            </w:pPr>
+            <w:r>
+              <w:t>Tabla prestamos, y actualización de la tabla libros</w:t>
+            </w:r>
+          </w:p>
+        </w:tc>
+        <w:tc>
+          <w:tcPr>
+            <w:tcW w:w="2385" w:type="dxa"/>
+            <w:tcMar>
+              <w:top w:w="100" w:type="dxa"/>
+              <w:left w:w="100" w:type="dxa"/>
+              <w:bottom w:w="100" w:type="dxa"/>
+              <w:right w:w="100" w:type="dxa"/>
+            </w:tcMar>
+          </w:tcPr>
+          <w:p>
+            <w:pPr>
+              <w:pStyle w:val="Prrafodelista"/>
               <w:widowControl w:val="0"/>
               <w:numPr>
                 <w:ilvl w:val="0"/>
-                <w:numId w:val="1"/>
+                <w:numId w:val="14"/>
               </w:numPr>
               <w:spacing w:line="240" w:lineRule="auto"/>
             </w:pPr>
             <w:r>
-              <w:t>Selección de libro disponible</w:t>
-            </w:r>
-          </w:p>
-          <w:p>
-            <w:pPr>
+              <w:t xml:space="preserve">El </w:t>
+            </w:r>
+            <w:r>
+              <w:t>préstamo debe estar activo</w:t>
+            </w:r>
+          </w:p>
+          <w:p>
+            <w:pPr>
+              <w:pStyle w:val="Prrafodelista"/>
               <w:widowControl w:val="0"/>
               <w:numPr>
                 <w:ilvl w:val="0"/>
-                <w:numId w:val="1"/>
+                <w:numId w:val="14"/>
               </w:numPr>
               <w:spacing w:line="240" w:lineRule="auto"/>
             </w:pPr>
             <w:r>
-              <w:t>Fecha estimada de devolución</w:t>
-            </w:r>
-          </w:p>
-        </w:tc>
-        <w:tc>
-          <w:tcPr>
-            <w:tcW w:w="1650" w:type="dxa"/>
-            <w:shd w:val="clear" w:color="auto" w:fill="auto"/>
-            <w:tcMar>
-              <w:top w:w="100" w:type="dxa"/>
-              <w:left w:w="100" w:type="dxa"/>
-              <w:bottom w:w="100" w:type="dxa"/>
-              <w:right w:w="100" w:type="dxa"/>
-            </w:tcMar>
-          </w:tcPr>
-          <w:p>
-            <w:pPr>
-              <w:widowControl w:val="0"/>
-              <w:spacing w:line="240" w:lineRule="auto"/>
-            </w:pPr>
-            <w:r>
-              <w:t>Maestro/Directora autenticado con permiso de préstamo</w:t>
-            </w:r>
-          </w:p>
-        </w:tc>
-        <w:tc>
-          <w:tcPr>
-            <w:tcW w:w="1515" w:type="dxa"/>
-            <w:shd w:val="clear" w:color="auto" w:fill="auto"/>
-            <w:tcMar>
-              <w:top w:w="100" w:type="dxa"/>
-              <w:left w:w="100" w:type="dxa"/>
-              <w:bottom w:w="100" w:type="dxa"/>
-              <w:right w:w="100" w:type="dxa"/>
-            </w:tcMar>
-          </w:tcPr>
-          <w:p>
-            <w:pPr>
-              <w:widowControl w:val="0"/>
-              <w:spacing w:line="240" w:lineRule="auto"/>
-            </w:pPr>
-            <w:r>
-              <w:t>Mensaje de confirmación o error en pantalla.</w:t>
-            </w:r>
-          </w:p>
-          <w:p>
-            <w:pPr>
-              <w:widowControl w:val="0"/>
-              <w:spacing w:line="240" w:lineRule="auto"/>
-            </w:pPr>
-          </w:p>
-          <w:p>
-            <w:pPr>
-              <w:widowControl w:val="0"/>
-              <w:spacing w:line="240" w:lineRule="auto"/>
-            </w:pPr>
-            <w:r>
-              <w:t>Actualización del inventario del libro</w:t>
-            </w:r>
-          </w:p>
-          <w:p>
-            <w:pPr>
-              <w:widowControl w:val="0"/>
-              <w:spacing w:line="240" w:lineRule="auto"/>
-            </w:pPr>
-          </w:p>
-          <w:p>
-            <w:pPr>
-              <w:widowControl w:val="0"/>
-              <w:spacing w:line="240" w:lineRule="auto"/>
-            </w:pPr>
-            <w:r>
-              <w:t>Registro en tabla prestamos</w:t>
-            </w:r>
-          </w:p>
-        </w:tc>
-        <w:tc>
-          <w:tcPr>
-            <w:tcW w:w="1965" w:type="dxa"/>
-            <w:shd w:val="clear" w:color="auto" w:fill="auto"/>
-            <w:tcMar>
-              <w:top w:w="100" w:type="dxa"/>
-              <w:left w:w="100" w:type="dxa"/>
-              <w:bottom w:w="100" w:type="dxa"/>
-              <w:right w:w="100" w:type="dxa"/>
-            </w:tcMar>
-          </w:tcPr>
-          <w:p>
-            <w:pPr>
-              <w:widowControl w:val="0"/>
-              <w:spacing w:line="240" w:lineRule="auto"/>
-            </w:pPr>
-            <w:r>
-              <w:t>Interfaz gráfica</w:t>
-            </w:r>
-          </w:p>
-          <w:p>
-            <w:pPr>
-              <w:widowControl w:val="0"/>
-              <w:spacing w:line="240" w:lineRule="auto"/>
-            </w:pPr>
-          </w:p>
-          <w:p>
-            <w:pPr>
-              <w:widowControl w:val="0"/>
-              <w:spacing w:line="240" w:lineRule="auto"/>
-            </w:pPr>
-            <w:r>
-              <w:t>Tabla prestamos, detalle_prestamos y actualización de la tabla libros</w:t>
-            </w:r>
-          </w:p>
-        </w:tc>
-        <w:tc>
-          <w:tcPr>
-            <w:tcW w:w="2385" w:type="dxa"/>
-            <w:shd w:val="clear" w:color="auto" w:fill="auto"/>
-            <w:tcMar>
-              <w:top w:w="100" w:type="dxa"/>
-              <w:left w:w="100" w:type="dxa"/>
-              <w:bottom w:w="100" w:type="dxa"/>
-              <w:right w:w="100" w:type="dxa"/>
-            </w:tcMar>
-          </w:tcPr>
+              <w:t>El usuario debe tener permisos</w:t>
+            </w:r>
+          </w:p>
           <w:p>
             <w:pPr>
               <w:pStyle w:val="Prrafodelista"/>
               <w:widowControl w:val="0"/>
               <w:numPr>
                 <w:ilvl w:val="0"/>
-                <w:numId w:val="11"/>
+                <w:numId w:val="14"/>
               </w:numPr>
               <w:spacing w:line="240" w:lineRule="auto"/>
             </w:pPr>
             <w:r>
-              <w:t>El alumno debe estar activo</w:t>
-            </w:r>
-          </w:p>
-          <w:p>
-            <w:pPr>
-              <w:pStyle w:val="Prrafodelista"/>
-              <w:widowControl w:val="0"/>
-              <w:numPr>
-                <w:ilvl w:val="0"/>
-                <w:numId w:val="11"/>
-              </w:numPr>
-              <w:spacing w:line="240" w:lineRule="auto"/>
-            </w:pPr>
-            <w:r>
-              <w:t>El usuario debe tener permiso para registrar un préstamo</w:t>
-            </w:r>
-          </w:p>
-          <w:p>
-            <w:pPr>
-              <w:pStyle w:val="Prrafodelista"/>
-              <w:widowControl w:val="0"/>
-              <w:numPr>
-                <w:ilvl w:val="0"/>
-                <w:numId w:val="11"/>
-              </w:numPr>
-              <w:spacing w:line="240" w:lineRule="auto"/>
-            </w:pPr>
-            <w:r>
-              <w:t>Debe haber al menos un libro seleccionado y con copias disponibles</w:t>
-            </w:r>
-          </w:p>
-          <w:p>
-            <w:pPr>
-              <w:pStyle w:val="Prrafodelista"/>
-              <w:widowControl w:val="0"/>
-              <w:numPr>
-                <w:ilvl w:val="0"/>
-                <w:numId w:val="11"/>
-              </w:numPr>
-              <w:spacing w:line="240" w:lineRule="auto"/>
-            </w:pPr>
-            <w:r>
-              <w:t>Fecha de devolución debe estar definida</w:t>
+              <w:t xml:space="preserve">Se debe seleccionar un préstamo válido </w:t>
             </w:r>
           </w:p>
           <w:p>
@@ -2689,7 +3734,6 @@
           <w:tcPr>
             <w:tcW w:w="7515" w:type="dxa"/>
             <w:gridSpan w:val="4"/>
-            <w:shd w:val="clear" w:color="auto" w:fill="auto"/>
             <w:tcMar>
               <w:top w:w="100" w:type="dxa"/>
               <w:left w:w="100" w:type="dxa"/>
@@ -2703,12 +3747,12 @@
               <w:widowControl w:val="0"/>
               <w:numPr>
                 <w:ilvl w:val="0"/>
-                <w:numId w:val="12"/>
+                <w:numId w:val="15"/>
               </w:numPr>
               <w:spacing w:line="240" w:lineRule="auto"/>
             </w:pPr>
             <w:r>
-              <w:t>El usuario inicia sesión</w:t>
+              <w:t>Se abre el historial de prestamos</w:t>
             </w:r>
           </w:p>
           <w:p>
@@ -2717,12 +3761,12 @@
               <w:widowControl w:val="0"/>
               <w:numPr>
                 <w:ilvl w:val="0"/>
-                <w:numId w:val="12"/>
+                <w:numId w:val="15"/>
               </w:numPr>
               <w:spacing w:line="240" w:lineRule="auto"/>
             </w:pPr>
             <w:r>
-              <w:t xml:space="preserve">Accede a la sección de prestamos </w:t>
+              <w:t>Se selecciona el préstamo deseado</w:t>
             </w:r>
           </w:p>
           <w:p>
@@ -2731,12 +3775,12 @@
               <w:widowControl w:val="0"/>
               <w:numPr>
                 <w:ilvl w:val="0"/>
-                <w:numId w:val="12"/>
+                <w:numId w:val="15"/>
               </w:numPr>
               <w:spacing w:line="240" w:lineRule="auto"/>
             </w:pPr>
             <w:r>
-              <w:t>Da clic en el botón “Nuevo préstamo”</w:t>
+              <w:t xml:space="preserve">Se marca como devuelto </w:t>
             </w:r>
           </w:p>
           <w:p>
@@ -2745,12 +3789,12 @@
               <w:widowControl w:val="0"/>
               <w:numPr>
                 <w:ilvl w:val="0"/>
-                <w:numId w:val="12"/>
+                <w:numId w:val="15"/>
               </w:numPr>
               <w:spacing w:line="240" w:lineRule="auto"/>
             </w:pPr>
             <w:r>
-              <w:t>Selecciona al alumno</w:t>
+              <w:t>El sistema modifica el préstamo</w:t>
             </w:r>
           </w:p>
           <w:p>
@@ -2759,54 +3803,12 @@
               <w:widowControl w:val="0"/>
               <w:numPr>
                 <w:ilvl w:val="0"/>
-                <w:numId w:val="12"/>
+                <w:numId w:val="15"/>
               </w:numPr>
               <w:spacing w:line="240" w:lineRule="auto"/>
             </w:pPr>
             <w:r>
-              <w:t>Selecciona uno o más libros con copias disponibles</w:t>
-            </w:r>
-          </w:p>
-          <w:p>
-            <w:pPr>
-              <w:pStyle w:val="Prrafodelista"/>
-              <w:widowControl w:val="0"/>
-              <w:numPr>
-                <w:ilvl w:val="0"/>
-                <w:numId w:val="12"/>
-              </w:numPr>
-              <w:spacing w:line="240" w:lineRule="auto"/>
-            </w:pPr>
-            <w:r>
-              <w:t>Indica fecha estimada de devolución</w:t>
-            </w:r>
-          </w:p>
-          <w:p>
-            <w:pPr>
-              <w:pStyle w:val="Prrafodelista"/>
-              <w:widowControl w:val="0"/>
-              <w:numPr>
-                <w:ilvl w:val="0"/>
-                <w:numId w:val="12"/>
-              </w:numPr>
-              <w:spacing w:line="240" w:lineRule="auto"/>
-            </w:pPr>
-            <w:r>
-              <w:t>Confirma el préstamo</w:t>
-            </w:r>
-          </w:p>
-          <w:p>
-            <w:pPr>
-              <w:pStyle w:val="Prrafodelista"/>
-              <w:widowControl w:val="0"/>
-              <w:numPr>
-                <w:ilvl w:val="0"/>
-                <w:numId w:val="12"/>
-              </w:numPr>
-              <w:spacing w:line="240" w:lineRule="auto"/>
-            </w:pPr>
-            <w:r>
-              <w:t>El sistema guarda el préstamo, reduce copias y muestra confirmación</w:t>
+              <w:t>Devuelve mensaje de éxito o de error</w:t>
             </w:r>
           </w:p>
         </w:tc>
@@ -2846,7 +3848,6 @@
           <w:tcPr>
             <w:tcW w:w="7515" w:type="dxa"/>
             <w:gridSpan w:val="4"/>
-            <w:shd w:val="clear" w:color="auto" w:fill="auto"/>
             <w:tcMar>
               <w:top w:w="100" w:type="dxa"/>
               <w:left w:w="100" w:type="dxa"/>
@@ -2865,7 +3866,19 @@
               <w:spacing w:line="240" w:lineRule="auto"/>
             </w:pPr>
             <w:r>
-              <w:t>Se reduce la cantidad de copias disponibles del libro</w:t>
+              <w:t xml:space="preserve">Se </w:t>
+            </w:r>
+            <w:r>
+              <w:t>actualiza</w:t>
+            </w:r>
+            <w:r>
+              <w:t xml:space="preserve"> la cantidad de copias disponibles del</w:t>
+            </w:r>
+            <w:r>
+              <w:t xml:space="preserve"> </w:t>
+            </w:r>
+            <w:r>
+              <w:t>libro</w:t>
             </w:r>
           </w:p>
           <w:p>
@@ -2879,7 +3892,16 @@
               <w:spacing w:line="240" w:lineRule="auto"/>
             </w:pPr>
             <w:r>
-              <w:t>Se crea una entrada en el historial de prestamos</w:t>
+              <w:t xml:space="preserve">Se </w:t>
+            </w:r>
+            <w:r>
+              <w:t>actualiza</w:t>
+            </w:r>
+            <w:r>
+              <w:t xml:space="preserve"> </w:t>
+            </w:r>
+            <w:r>
+              <w:t>el registro del préstamo con la fecha de devolución</w:t>
             </w:r>
           </w:p>
           <w:p>
@@ -2893,23 +3915,22 @@
               <w:spacing w:line="240" w:lineRule="auto"/>
             </w:pPr>
             <w:r>
-              <w:t xml:space="preserve">El préstamo queda vinculado al usuario que lo registró </w:t>
+              <w:t>La acción queda vinculada al usuario que la ejecutó</w:t>
+            </w:r>
+            <w:r>
+              <w:t xml:space="preserve"> </w:t>
             </w:r>
           </w:p>
         </w:tc>
       </w:tr>
-      <w:bookmarkEnd w:id="2"/>
+      <w:bookmarkEnd w:id="3"/>
     </w:tbl>
-    <w:p/>
     <w:p>
       <w:pPr>
         <w:tabs>
           <w:tab w:val="left" w:pos="1626"/>
         </w:tabs>
       </w:pPr>
-      <w:r>
-        <w:tab/>
-      </w:r>
     </w:p>
     <w:p>
       <w:r>
@@ -2964,7 +3985,7 @@
                 <w:b/>
               </w:rPr>
             </w:pPr>
-            <w:bookmarkStart w:id="3" w:name="_Hlk202910813"/>
+            <w:bookmarkStart w:id="4" w:name="_Hlk202912294"/>
             <w:r>
               <w:rPr>
                 <w:b/>
@@ -3097,21 +4118,20 @@
         <w:tc>
           <w:tcPr>
             <w:tcW w:w="2100" w:type="dxa"/>
-            <w:shd w:val="clear" w:color="auto" w:fill="auto"/>
-            <w:tcMar>
-              <w:top w:w="100" w:type="dxa"/>
-              <w:left w:w="100" w:type="dxa"/>
-              <w:bottom w:w="100" w:type="dxa"/>
-              <w:right w:w="100" w:type="dxa"/>
-            </w:tcMar>
-          </w:tcPr>
-          <w:p>
-            <w:pPr>
-              <w:widowControl w:val="0"/>
-              <w:spacing w:line="240" w:lineRule="auto"/>
-            </w:pPr>
-            <w:r>
-              <w:t>R.F.4</w:t>
+            <w:tcMar>
+              <w:top w:w="100" w:type="dxa"/>
+              <w:left w:w="100" w:type="dxa"/>
+              <w:bottom w:w="100" w:type="dxa"/>
+              <w:right w:w="100" w:type="dxa"/>
+            </w:tcMar>
+          </w:tcPr>
+          <w:p>
+            <w:pPr>
+              <w:widowControl w:val="0"/>
+              <w:spacing w:line="240" w:lineRule="auto"/>
+            </w:pPr>
+            <w:r>
+              <w:t>R.F.5</w:t>
             </w:r>
           </w:p>
         </w:tc>
@@ -3119,7 +4139,6 @@
           <w:tcPr>
             <w:tcW w:w="3165" w:type="dxa"/>
             <w:gridSpan w:val="2"/>
-            <w:shd w:val="clear" w:color="auto" w:fill="auto"/>
             <w:tcMar>
               <w:top w:w="100" w:type="dxa"/>
               <w:left w:w="100" w:type="dxa"/>
@@ -3134,49 +4153,53 @@
               <w:jc w:val="center"/>
             </w:pPr>
             <w:r>
-              <w:t>Registrar devolución</w:t>
+              <w:t>Eliminar libro</w:t>
             </w:r>
           </w:p>
         </w:tc>
         <w:tc>
           <w:tcPr>
             <w:tcW w:w="1965" w:type="dxa"/>
-            <w:shd w:val="clear" w:color="auto" w:fill="auto"/>
-            <w:tcMar>
-              <w:top w:w="100" w:type="dxa"/>
-              <w:left w:w="100" w:type="dxa"/>
-              <w:bottom w:w="100" w:type="dxa"/>
-              <w:right w:w="100" w:type="dxa"/>
-            </w:tcMar>
-          </w:tcPr>
-          <w:p>
-            <w:pPr>
-              <w:widowControl w:val="0"/>
-              <w:spacing w:line="240" w:lineRule="auto"/>
-            </w:pPr>
-            <w:r>
-              <w:t>05/07/2025</w:t>
+            <w:tcMar>
+              <w:top w:w="100" w:type="dxa"/>
+              <w:left w:w="100" w:type="dxa"/>
+              <w:bottom w:w="100" w:type="dxa"/>
+              <w:right w:w="100" w:type="dxa"/>
+            </w:tcMar>
+          </w:tcPr>
+          <w:p>
+            <w:pPr>
+              <w:widowControl w:val="0"/>
+              <w:spacing w:line="240" w:lineRule="auto"/>
+            </w:pPr>
+            <w:r>
+              <w:t>0</w:t>
+            </w:r>
+            <w:r>
+              <w:t>7</w:t>
+            </w:r>
+            <w:r>
+              <w:t>/07/2025</w:t>
             </w:r>
           </w:p>
         </w:tc>
         <w:tc>
           <w:tcPr>
             <w:tcW w:w="2385" w:type="dxa"/>
-            <w:shd w:val="clear" w:color="auto" w:fill="auto"/>
-            <w:tcMar>
-              <w:top w:w="100" w:type="dxa"/>
-              <w:left w:w="100" w:type="dxa"/>
-              <w:bottom w:w="100" w:type="dxa"/>
-              <w:right w:w="100" w:type="dxa"/>
-            </w:tcMar>
-          </w:tcPr>
-          <w:p>
-            <w:pPr>
-              <w:widowControl w:val="0"/>
-              <w:spacing w:line="240" w:lineRule="auto"/>
-            </w:pPr>
-            <w:r>
-              <w:t>Necesaria</w:t>
+            <w:tcMar>
+              <w:top w:w="100" w:type="dxa"/>
+              <w:left w:w="100" w:type="dxa"/>
+              <w:bottom w:w="100" w:type="dxa"/>
+              <w:right w:w="100" w:type="dxa"/>
+            </w:tcMar>
+          </w:tcPr>
+          <w:p>
+            <w:pPr>
+              <w:widowControl w:val="0"/>
+              <w:spacing w:line="240" w:lineRule="auto"/>
+            </w:pPr>
+            <w:r>
+              <w:t>Importante</w:t>
             </w:r>
           </w:p>
         </w:tc>
@@ -3216,24 +4239,20 @@
           <w:tcPr>
             <w:tcW w:w="7515" w:type="dxa"/>
             <w:gridSpan w:val="4"/>
-            <w:shd w:val="clear" w:color="auto" w:fill="auto"/>
-            <w:tcMar>
-              <w:top w:w="100" w:type="dxa"/>
-              <w:left w:w="100" w:type="dxa"/>
-              <w:bottom w:w="100" w:type="dxa"/>
-              <w:right w:w="100" w:type="dxa"/>
-            </w:tcMar>
-          </w:tcPr>
-          <w:p>
-            <w:pPr>
-              <w:widowControl w:val="0"/>
-              <w:spacing w:line="240" w:lineRule="auto"/>
-            </w:pPr>
-            <w:r>
-              <w:t>Permite re</w:t>
-            </w:r>
-            <w:r>
-              <w:t xml:space="preserve">gistrar la devolución de un préstamo de libro, para así poder volver a tener en inventario el libro devuelto </w:t>
+            <w:tcMar>
+              <w:top w:w="100" w:type="dxa"/>
+              <w:left w:w="100" w:type="dxa"/>
+              <w:bottom w:w="100" w:type="dxa"/>
+              <w:right w:w="100" w:type="dxa"/>
+            </w:tcMar>
+          </w:tcPr>
+          <w:p>
+            <w:pPr>
+              <w:widowControl w:val="0"/>
+              <w:spacing w:line="240" w:lineRule="auto"/>
+            </w:pPr>
+            <w:r>
+              <w:t>Permite eliminar lógicamente un libro del sistema (cambiando su estado a inactivo) para evitar que esté disponible para nuevos préstamos, sin borrar su historial.</w:t>
             </w:r>
           </w:p>
         </w:tc>
@@ -3379,7 +4398,6 @@
         <w:tc>
           <w:tcPr>
             <w:tcW w:w="2100" w:type="dxa"/>
-            <w:shd w:val="clear" w:color="auto" w:fill="auto"/>
             <w:tcMar>
               <w:top w:w="100" w:type="dxa"/>
               <w:left w:w="100" w:type="dxa"/>
@@ -3397,164 +4415,174 @@
               <w:spacing w:line="240" w:lineRule="auto"/>
             </w:pPr>
             <w:r>
-              <w:t xml:space="preserve">Préstamo seleccionado </w:t>
-            </w:r>
-            <w:r>
-              <w:t xml:space="preserve"> </w:t>
-            </w:r>
-          </w:p>
-        </w:tc>
-        <w:tc>
-          <w:tcPr>
-            <w:tcW w:w="1650" w:type="dxa"/>
-            <w:shd w:val="clear" w:color="auto" w:fill="auto"/>
-            <w:tcMar>
-              <w:top w:w="100" w:type="dxa"/>
-              <w:left w:w="100" w:type="dxa"/>
-              <w:bottom w:w="100" w:type="dxa"/>
-              <w:right w:w="100" w:type="dxa"/>
-            </w:tcMar>
-          </w:tcPr>
-          <w:p>
-            <w:pPr>
-              <w:widowControl w:val="0"/>
-              <w:spacing w:line="240" w:lineRule="auto"/>
-            </w:pPr>
-            <w:r>
-              <w:t>Maestro/Directora autenticado con permiso de préstamo</w:t>
-            </w:r>
-          </w:p>
-        </w:tc>
-        <w:tc>
-          <w:tcPr>
-            <w:tcW w:w="1515" w:type="dxa"/>
-            <w:shd w:val="clear" w:color="auto" w:fill="auto"/>
-            <w:tcMar>
-              <w:top w:w="100" w:type="dxa"/>
-              <w:left w:w="100" w:type="dxa"/>
-              <w:bottom w:w="100" w:type="dxa"/>
-              <w:right w:w="100" w:type="dxa"/>
-            </w:tcMar>
-          </w:tcPr>
-          <w:p>
-            <w:pPr>
-              <w:widowControl w:val="0"/>
-              <w:spacing w:line="240" w:lineRule="auto"/>
-            </w:pPr>
-            <w:r>
-              <w:t>Mensaje de confirmación o error en pantalla.</w:t>
-            </w:r>
-          </w:p>
-          <w:p>
-            <w:pPr>
-              <w:widowControl w:val="0"/>
-              <w:spacing w:line="240" w:lineRule="auto"/>
-            </w:pPr>
-          </w:p>
-          <w:p>
-            <w:pPr>
-              <w:widowControl w:val="0"/>
-              <w:spacing w:line="240" w:lineRule="auto"/>
-            </w:pPr>
-            <w:r>
-              <w:t>Actualización del inventario del libro</w:t>
-            </w:r>
-          </w:p>
-          <w:p>
-            <w:pPr>
-              <w:widowControl w:val="0"/>
-              <w:spacing w:line="240" w:lineRule="auto"/>
-            </w:pPr>
-          </w:p>
-          <w:p>
-            <w:pPr>
-              <w:widowControl w:val="0"/>
-              <w:spacing w:line="240" w:lineRule="auto"/>
-            </w:pPr>
-            <w:r>
-              <w:t>Actualización</w:t>
-            </w:r>
-            <w:r>
-              <w:t xml:space="preserve"> en tabla prestamos</w:t>
-            </w:r>
-          </w:p>
-        </w:tc>
-        <w:tc>
-          <w:tcPr>
-            <w:tcW w:w="1965" w:type="dxa"/>
-            <w:shd w:val="clear" w:color="auto" w:fill="auto"/>
-            <w:tcMar>
-              <w:top w:w="100" w:type="dxa"/>
-              <w:left w:w="100" w:type="dxa"/>
-              <w:bottom w:w="100" w:type="dxa"/>
-              <w:right w:w="100" w:type="dxa"/>
-            </w:tcMar>
-          </w:tcPr>
-          <w:p>
-            <w:pPr>
-              <w:widowControl w:val="0"/>
-              <w:spacing w:line="240" w:lineRule="auto"/>
-            </w:pPr>
-            <w:r>
-              <w:t>Interfaz gráfica</w:t>
-            </w:r>
-          </w:p>
-          <w:p>
-            <w:pPr>
-              <w:widowControl w:val="0"/>
-              <w:spacing w:line="240" w:lineRule="auto"/>
-            </w:pPr>
-          </w:p>
-          <w:p>
-            <w:pPr>
-              <w:widowControl w:val="0"/>
-              <w:spacing w:line="240" w:lineRule="auto"/>
-            </w:pPr>
-            <w:r>
-              <w:t>Tabla prestamos, y actualización de la tabla libros</w:t>
-            </w:r>
-          </w:p>
-        </w:tc>
-        <w:tc>
-          <w:tcPr>
-            <w:tcW w:w="2385" w:type="dxa"/>
-            <w:shd w:val="clear" w:color="auto" w:fill="auto"/>
-            <w:tcMar>
-              <w:top w:w="100" w:type="dxa"/>
-              <w:left w:w="100" w:type="dxa"/>
-              <w:bottom w:w="100" w:type="dxa"/>
-              <w:right w:w="100" w:type="dxa"/>
-            </w:tcMar>
-          </w:tcPr>
-          <w:p>
-            <w:pPr>
-              <w:pStyle w:val="Prrafodelista"/>
+              <w:t xml:space="preserve">Libro seleccionado </w:t>
+            </w:r>
+          </w:p>
+          <w:p>
+            <w:pPr>
               <w:widowControl w:val="0"/>
               <w:numPr>
                 <w:ilvl w:val="0"/>
-                <w:numId w:val="14"/>
+                <w:numId w:val="1"/>
               </w:numPr>
               <w:spacing w:line="240" w:lineRule="auto"/>
             </w:pPr>
             <w:r>
-              <w:t xml:space="preserve">El </w:t>
-            </w:r>
-            <w:r>
-              <w:t>préstamo debe estar activo</w:t>
-            </w:r>
-          </w:p>
+              <w:t>Contraseña de director o Root</w:t>
+            </w:r>
+            <w:r>
+              <w:t xml:space="preserve"> </w:t>
+            </w:r>
+            <w:r>
+              <w:t xml:space="preserve">  </w:t>
+            </w:r>
+          </w:p>
+        </w:tc>
+        <w:tc>
+          <w:tcPr>
+            <w:tcW w:w="1650" w:type="dxa"/>
+            <w:tcMar>
+              <w:top w:w="100" w:type="dxa"/>
+              <w:left w:w="100" w:type="dxa"/>
+              <w:bottom w:w="100" w:type="dxa"/>
+              <w:right w:w="100" w:type="dxa"/>
+            </w:tcMar>
+          </w:tcPr>
+          <w:p>
+            <w:pPr>
+              <w:widowControl w:val="0"/>
+              <w:spacing w:line="240" w:lineRule="auto"/>
+            </w:pPr>
+            <w:r>
+              <w:t xml:space="preserve">Maestro autenticado con permisos de acceso, validado por credenciales del director o </w:t>
+            </w:r>
+            <w:proofErr w:type="spellStart"/>
+            <w:r>
+              <w:t>root</w:t>
+            </w:r>
+            <w:proofErr w:type="spellEnd"/>
+            <w:r>
+              <w:t>.</w:t>
+            </w:r>
+          </w:p>
+        </w:tc>
+        <w:tc>
+          <w:tcPr>
+            <w:tcW w:w="1515" w:type="dxa"/>
+            <w:tcMar>
+              <w:top w:w="100" w:type="dxa"/>
+              <w:left w:w="100" w:type="dxa"/>
+              <w:bottom w:w="100" w:type="dxa"/>
+              <w:right w:w="100" w:type="dxa"/>
+            </w:tcMar>
+          </w:tcPr>
+          <w:p>
+            <w:pPr>
+              <w:widowControl w:val="0"/>
+              <w:spacing w:line="240" w:lineRule="auto"/>
+            </w:pPr>
+            <w:r>
+              <w:t>Mensaje de confirmación o error en pantalla.</w:t>
+            </w:r>
+          </w:p>
+          <w:p>
+            <w:pPr>
+              <w:widowControl w:val="0"/>
+              <w:spacing w:line="240" w:lineRule="auto"/>
+            </w:pPr>
+          </w:p>
+          <w:p>
+            <w:pPr>
+              <w:widowControl w:val="0"/>
+              <w:spacing w:line="240" w:lineRule="auto"/>
+            </w:pPr>
+            <w:r>
+              <w:t xml:space="preserve">Actualización </w:t>
+            </w:r>
+            <w:proofErr w:type="spellStart"/>
+            <w:r>
+              <w:t>logica</w:t>
+            </w:r>
+            <w:proofErr w:type="spellEnd"/>
+            <w:r>
+              <w:t xml:space="preserve"> del registro </w:t>
+            </w:r>
+          </w:p>
+          <w:p>
+            <w:pPr>
+              <w:widowControl w:val="0"/>
+              <w:spacing w:line="240" w:lineRule="auto"/>
+            </w:pPr>
+          </w:p>
+        </w:tc>
+        <w:tc>
+          <w:tcPr>
+            <w:tcW w:w="1965" w:type="dxa"/>
+            <w:tcMar>
+              <w:top w:w="100" w:type="dxa"/>
+              <w:left w:w="100" w:type="dxa"/>
+              <w:bottom w:w="100" w:type="dxa"/>
+              <w:right w:w="100" w:type="dxa"/>
+            </w:tcMar>
+          </w:tcPr>
+          <w:p>
+            <w:pPr>
+              <w:widowControl w:val="0"/>
+              <w:spacing w:line="240" w:lineRule="auto"/>
+            </w:pPr>
+            <w:r>
+              <w:t>Interfaz gráfica</w:t>
+            </w:r>
+          </w:p>
+          <w:p>
+            <w:pPr>
+              <w:widowControl w:val="0"/>
+              <w:spacing w:line="240" w:lineRule="auto"/>
+            </w:pPr>
+          </w:p>
+          <w:p>
+            <w:pPr>
+              <w:widowControl w:val="0"/>
+              <w:spacing w:line="240" w:lineRule="auto"/>
+            </w:pPr>
+            <w:r>
+              <w:t>T</w:t>
+            </w:r>
+            <w:r>
+              <w:t xml:space="preserve">abla </w:t>
+            </w:r>
+            <w:r>
+              <w:t>libros</w:t>
+            </w:r>
+          </w:p>
+        </w:tc>
+        <w:tc>
+          <w:tcPr>
+            <w:tcW w:w="2385" w:type="dxa"/>
+            <w:tcMar>
+              <w:top w:w="100" w:type="dxa"/>
+              <w:left w:w="100" w:type="dxa"/>
+              <w:bottom w:w="100" w:type="dxa"/>
+              <w:right w:w="100" w:type="dxa"/>
+            </w:tcMar>
+          </w:tcPr>
           <w:p>
             <w:pPr>
               <w:pStyle w:val="Prrafodelista"/>
               <w:widowControl w:val="0"/>
               <w:numPr>
                 <w:ilvl w:val="0"/>
-                <w:numId w:val="14"/>
+                <w:numId w:val="18"/>
               </w:numPr>
-              <w:spacing w:line="240" w:lineRule="auto"/>
-            </w:pPr>
-            <w:r>
-              <w:t>El usuario debe tener permisos</w:t>
+              <w:rPr>
+                <w:lang w:val="es-MX"/>
+              </w:rPr>
+            </w:pPr>
+            <w:r>
+              <w:rPr>
+                <w:lang w:val="es-MX"/>
+              </w:rPr>
+              <w:t xml:space="preserve"> El libro debe estar activo</w:t>
             </w:r>
           </w:p>
           <w:p>
@@ -3563,18 +4591,45 @@
               <w:widowControl w:val="0"/>
               <w:numPr>
                 <w:ilvl w:val="0"/>
-                <w:numId w:val="14"/>
+                <w:numId w:val="18"/>
               </w:numPr>
-              <w:spacing w:line="240" w:lineRule="auto"/>
-            </w:pPr>
-            <w:r>
-              <w:t xml:space="preserve">Se debe seleccionar un préstamo válido </w:t>
-            </w:r>
-          </w:p>
-          <w:p>
-            <w:pPr>
-              <w:widowControl w:val="0"/>
-              <w:spacing w:line="240" w:lineRule="auto"/>
+              <w:rPr>
+                <w:lang w:val="es-MX"/>
+              </w:rPr>
+            </w:pPr>
+            <w:r>
+              <w:rPr>
+                <w:lang w:val="es-MX"/>
+              </w:rPr>
+              <w:t>El usuario debe estar autenticado</w:t>
+            </w:r>
+          </w:p>
+          <w:p>
+            <w:pPr>
+              <w:pStyle w:val="Prrafodelista"/>
+              <w:widowControl w:val="0"/>
+              <w:numPr>
+                <w:ilvl w:val="0"/>
+                <w:numId w:val="18"/>
+              </w:numPr>
+              <w:rPr>
+                <w:lang w:val="es-MX"/>
+              </w:rPr>
+            </w:pPr>
+            <w:r>
+              <w:rPr>
+                <w:lang w:val="es-MX"/>
+              </w:rPr>
+              <w:t>Se debe ingresar correctamente la contraseña de validación</w:t>
+            </w:r>
+          </w:p>
+          <w:p>
+            <w:pPr>
+              <w:widowControl w:val="0"/>
+              <w:spacing w:line="240" w:lineRule="auto"/>
+              <w:rPr>
+                <w:lang w:val="es-MX"/>
+              </w:rPr>
             </w:pPr>
           </w:p>
           <w:p>
@@ -3620,7 +4675,6 @@
           <w:tcPr>
             <w:tcW w:w="7515" w:type="dxa"/>
             <w:gridSpan w:val="4"/>
-            <w:shd w:val="clear" w:color="auto" w:fill="auto"/>
             <w:tcMar>
               <w:top w:w="100" w:type="dxa"/>
               <w:left w:w="100" w:type="dxa"/>
@@ -3634,12 +4688,12 @@
               <w:widowControl w:val="0"/>
               <w:numPr>
                 <w:ilvl w:val="0"/>
-                <w:numId w:val="15"/>
+                <w:numId w:val="19"/>
               </w:numPr>
               <w:spacing w:line="240" w:lineRule="auto"/>
             </w:pPr>
             <w:r>
-              <w:t>Se abre el historial de prestamos</w:t>
+              <w:t>Se selecciona el libro</w:t>
             </w:r>
           </w:p>
           <w:p>
@@ -3648,12 +4702,30 @@
               <w:widowControl w:val="0"/>
               <w:numPr>
                 <w:ilvl w:val="0"/>
-                <w:numId w:val="15"/>
+                <w:numId w:val="19"/>
               </w:numPr>
               <w:spacing w:line="240" w:lineRule="auto"/>
             </w:pPr>
             <w:r>
-              <w:t>Se selecciona el préstamo deseado</w:t>
+              <w:t xml:space="preserve">Se da </w:t>
+            </w:r>
+            <w:proofErr w:type="spellStart"/>
+            <w:proofErr w:type="gramStart"/>
+            <w:r>
+              <w:t>click</w:t>
+            </w:r>
+            <w:proofErr w:type="spellEnd"/>
+            <w:proofErr w:type="gramEnd"/>
+            <w:r>
+              <w:t xml:space="preserve"> en el </w:t>
+            </w:r>
+            <w:proofErr w:type="spellStart"/>
+            <w:r>
+              <w:t>boton</w:t>
+            </w:r>
+            <w:proofErr w:type="spellEnd"/>
+            <w:r>
+              <w:t xml:space="preserve"> de eliminar libro</w:t>
             </w:r>
           </w:p>
           <w:p>
@@ -3662,12 +4734,20 @@
               <w:widowControl w:val="0"/>
               <w:numPr>
                 <w:ilvl w:val="0"/>
-                <w:numId w:val="15"/>
+                <w:numId w:val="19"/>
               </w:numPr>
               <w:spacing w:line="240" w:lineRule="auto"/>
             </w:pPr>
             <w:r>
-              <w:t xml:space="preserve">Se marca como devuelto </w:t>
+              <w:t xml:space="preserve">Se solicita contraseña del </w:t>
+            </w:r>
+            <w:proofErr w:type="spellStart"/>
+            <w:r>
+              <w:t>root</w:t>
+            </w:r>
+            <w:proofErr w:type="spellEnd"/>
+            <w:r>
+              <w:t>/director</w:t>
             </w:r>
           </w:p>
           <w:p>
@@ -3676,12 +4756,12 @@
               <w:widowControl w:val="0"/>
               <w:numPr>
                 <w:ilvl w:val="0"/>
-                <w:numId w:val="15"/>
+                <w:numId w:val="19"/>
               </w:numPr>
               <w:spacing w:line="240" w:lineRule="auto"/>
             </w:pPr>
             <w:r>
-              <w:t>El sistema modifica el préstamo</w:t>
+              <w:t>Se valida la contraseña</w:t>
             </w:r>
           </w:p>
           <w:p>
@@ -3690,12 +4770,26 @@
               <w:widowControl w:val="0"/>
               <w:numPr>
                 <w:ilvl w:val="0"/>
-                <w:numId w:val="15"/>
+                <w:numId w:val="19"/>
               </w:numPr>
               <w:spacing w:line="240" w:lineRule="auto"/>
             </w:pPr>
             <w:r>
-              <w:t>Devuelve mensaje de éxito o de error</w:t>
+              <w:t>El libro se marca como inactivo en base de datos</w:t>
+            </w:r>
+          </w:p>
+          <w:p>
+            <w:pPr>
+              <w:pStyle w:val="Prrafodelista"/>
+              <w:widowControl w:val="0"/>
+              <w:numPr>
+                <w:ilvl w:val="0"/>
+                <w:numId w:val="19"/>
+              </w:numPr>
+              <w:spacing w:line="240" w:lineRule="auto"/>
+            </w:pPr>
+            <w:r>
+              <w:t xml:space="preserve">Se muestra un mensaje de confirmación o error </w:t>
             </w:r>
           </w:p>
         </w:tc>
@@ -3735,7 +4829,6 @@
           <w:tcPr>
             <w:tcW w:w="7515" w:type="dxa"/>
             <w:gridSpan w:val="4"/>
-            <w:shd w:val="clear" w:color="auto" w:fill="auto"/>
             <w:tcMar>
               <w:top w:w="100" w:type="dxa"/>
               <w:left w:w="100" w:type="dxa"/>
@@ -3754,962 +4847,13 @@
               <w:spacing w:line="240" w:lineRule="auto"/>
             </w:pPr>
             <w:r>
-              <w:t xml:space="preserve">Se </w:t>
-            </w:r>
-            <w:r>
-              <w:t>actualiza</w:t>
-            </w:r>
-            <w:r>
-              <w:t xml:space="preserve"> la cantidad de copias disponibles del</w:t>
-            </w:r>
-            <w:r>
-              <w:t xml:space="preserve"> </w:t>
-            </w:r>
-            <w:r>
-              <w:t>libro</w:t>
-            </w:r>
-          </w:p>
-          <w:p>
-            <w:pPr>
-              <w:pStyle w:val="Prrafodelista"/>
-              <w:widowControl w:val="0"/>
-              <w:numPr>
-                <w:ilvl w:val="0"/>
-                <w:numId w:val="13"/>
-              </w:numPr>
-              <w:spacing w:line="240" w:lineRule="auto"/>
-            </w:pPr>
-            <w:r>
-              <w:t xml:space="preserve">Se </w:t>
-            </w:r>
-            <w:r>
-              <w:t>actualiza</w:t>
-            </w:r>
-            <w:r>
-              <w:t xml:space="preserve"> </w:t>
-            </w:r>
-            <w:r>
-              <w:t>el registro del préstamo con la fecha de devolución</w:t>
-            </w:r>
-          </w:p>
-          <w:p>
-            <w:pPr>
-              <w:pStyle w:val="Prrafodelista"/>
-              <w:widowControl w:val="0"/>
-              <w:numPr>
-                <w:ilvl w:val="0"/>
-                <w:numId w:val="13"/>
-              </w:numPr>
-              <w:spacing w:line="240" w:lineRule="auto"/>
-            </w:pPr>
-            <w:r>
-              <w:t>La acción queda vinculada al usuario que la ejecutó</w:t>
-            </w:r>
-            <w:r>
-              <w:t xml:space="preserve"> </w:t>
-            </w:r>
-          </w:p>
-        </w:tc>
-      </w:tr>
-      <w:bookmarkEnd w:id="3"/>
-    </w:tbl>
-    <w:p>
-      <w:pPr>
-        <w:tabs>
-          <w:tab w:val="left" w:pos="1626"/>
-        </w:tabs>
-      </w:pPr>
-    </w:p>
-    <w:p>
-      <w:r>
-        <w:br w:type="page"/>
-      </w:r>
-    </w:p>
-    <w:tbl>
-      <w:tblPr>
-        <w:tblStyle w:val="1"/>
-        <w:tblW w:w="9615" w:type="dxa"/>
-        <w:tblInd w:w="0" w:type="dxa"/>
-        <w:tblBorders>
-          <w:top w:val="single" w:sz="8" w:space="0" w:color="000000"/>
-          <w:left w:val="single" w:sz="8" w:space="0" w:color="000000"/>
-          <w:bottom w:val="single" w:sz="8" w:space="0" w:color="000000"/>
-          <w:right w:val="single" w:sz="8" w:space="0" w:color="000000"/>
-          <w:insideH w:val="single" w:sz="8" w:space="0" w:color="000000"/>
-          <w:insideV w:val="single" w:sz="8" w:space="0" w:color="000000"/>
-        </w:tblBorders>
-        <w:tblLayout w:type="fixed"/>
-        <w:tblLook w:val="0600" w:firstRow="0" w:lastRow="0" w:firstColumn="0" w:lastColumn="0" w:noHBand="1" w:noVBand="1"/>
-      </w:tblPr>
-      <w:tblGrid>
-        <w:gridCol w:w="2100"/>
-        <w:gridCol w:w="1650"/>
-        <w:gridCol w:w="1515"/>
-        <w:gridCol w:w="1965"/>
-        <w:gridCol w:w="2385"/>
-      </w:tblGrid>
-      <w:tr>
-        <w:trPr>
-          <w:trHeight w:val="420"/>
-        </w:trPr>
-        <w:tc>
-          <w:tcPr>
-            <w:tcW w:w="9615" w:type="dxa"/>
-            <w:gridSpan w:val="5"/>
-            <w:shd w:val="clear" w:color="auto" w:fill="D9D9D9"/>
-            <w:tcMar>
-              <w:top w:w="100" w:type="dxa"/>
-              <w:left w:w="100" w:type="dxa"/>
-              <w:bottom w:w="100" w:type="dxa"/>
-              <w:right w:w="100" w:type="dxa"/>
-            </w:tcMar>
-          </w:tcPr>
-          <w:p>
-            <w:pPr>
-              <w:widowControl w:val="0"/>
-              <w:spacing w:line="240" w:lineRule="auto"/>
-              <w:jc w:val="center"/>
-              <w:rPr>
-                <w:b/>
-              </w:rPr>
-            </w:pPr>
-            <w:bookmarkStart w:id="4" w:name="_Hlk202912294"/>
-            <w:r>
-              <w:rPr>
-                <w:b/>
-              </w:rPr>
-              <w:lastRenderedPageBreak/>
-              <w:t>Especificación de requerimientos</w:t>
-            </w:r>
-          </w:p>
-        </w:tc>
-      </w:tr>
-      <w:tr>
-        <w:trPr>
-          <w:trHeight w:val="420"/>
-        </w:trPr>
-        <w:tc>
-          <w:tcPr>
-            <w:tcW w:w="2100" w:type="dxa"/>
-            <w:shd w:val="clear" w:color="auto" w:fill="D9D9D9"/>
-            <w:tcMar>
-              <w:top w:w="100" w:type="dxa"/>
-              <w:left w:w="100" w:type="dxa"/>
-              <w:bottom w:w="100" w:type="dxa"/>
-              <w:right w:w="100" w:type="dxa"/>
-            </w:tcMar>
-          </w:tcPr>
-          <w:p>
-            <w:pPr>
-              <w:widowControl w:val="0"/>
-              <w:spacing w:line="240" w:lineRule="auto"/>
-              <w:rPr>
-                <w:b/>
-              </w:rPr>
-            </w:pPr>
-            <w:r>
-              <w:rPr>
-                <w:b/>
-              </w:rPr>
-              <w:t>Código</w:t>
-            </w:r>
-          </w:p>
-        </w:tc>
-        <w:tc>
-          <w:tcPr>
-            <w:tcW w:w="3165" w:type="dxa"/>
-            <w:gridSpan w:val="2"/>
-            <w:shd w:val="clear" w:color="auto" w:fill="D9D9D9"/>
-            <w:tcMar>
-              <w:top w:w="100" w:type="dxa"/>
-              <w:left w:w="100" w:type="dxa"/>
-              <w:bottom w:w="100" w:type="dxa"/>
-              <w:right w:w="100" w:type="dxa"/>
-            </w:tcMar>
-          </w:tcPr>
-          <w:p>
-            <w:pPr>
-              <w:widowControl w:val="0"/>
-              <w:spacing w:line="240" w:lineRule="auto"/>
-              <w:jc w:val="center"/>
-              <w:rPr>
-                <w:b/>
-              </w:rPr>
-            </w:pPr>
-            <w:r>
-              <w:rPr>
-                <w:b/>
-              </w:rPr>
-              <w:t>Nombre</w:t>
-            </w:r>
-          </w:p>
-        </w:tc>
-        <w:tc>
-          <w:tcPr>
-            <w:tcW w:w="1965" w:type="dxa"/>
-            <w:shd w:val="clear" w:color="auto" w:fill="D9D9D9"/>
-            <w:tcMar>
-              <w:top w:w="100" w:type="dxa"/>
-              <w:left w:w="100" w:type="dxa"/>
-              <w:bottom w:w="100" w:type="dxa"/>
-              <w:right w:w="100" w:type="dxa"/>
-            </w:tcMar>
-          </w:tcPr>
-          <w:p>
-            <w:pPr>
-              <w:widowControl w:val="0"/>
-              <w:spacing w:line="240" w:lineRule="auto"/>
-              <w:rPr>
-                <w:b/>
-              </w:rPr>
-            </w:pPr>
-            <w:r>
-              <w:rPr>
-                <w:b/>
-              </w:rPr>
-              <w:t>Fecha</w:t>
-            </w:r>
-          </w:p>
-        </w:tc>
-        <w:tc>
-          <w:tcPr>
-            <w:tcW w:w="2385" w:type="dxa"/>
-            <w:shd w:val="clear" w:color="auto" w:fill="D9D9D9"/>
-            <w:tcMar>
-              <w:top w:w="100" w:type="dxa"/>
-              <w:left w:w="100" w:type="dxa"/>
-              <w:bottom w:w="100" w:type="dxa"/>
-              <w:right w:w="100" w:type="dxa"/>
-            </w:tcMar>
-          </w:tcPr>
-          <w:p>
-            <w:pPr>
-              <w:widowControl w:val="0"/>
-              <w:spacing w:line="240" w:lineRule="auto"/>
-              <w:rPr>
-                <w:b/>
-              </w:rPr>
-            </w:pPr>
-            <w:r>
-              <w:rPr>
-                <w:b/>
-              </w:rPr>
-              <w:t>Grado de necesidad</w:t>
-            </w:r>
-          </w:p>
-        </w:tc>
-      </w:tr>
-      <w:tr>
-        <w:trPr>
-          <w:trHeight w:val="447"/>
-        </w:trPr>
-        <w:tc>
-          <w:tcPr>
-            <w:tcW w:w="2100" w:type="dxa"/>
-            <w:shd w:val="clear" w:color="auto" w:fill="auto"/>
-            <w:tcMar>
-              <w:top w:w="100" w:type="dxa"/>
-              <w:left w:w="100" w:type="dxa"/>
-              <w:bottom w:w="100" w:type="dxa"/>
-              <w:right w:w="100" w:type="dxa"/>
-            </w:tcMar>
-          </w:tcPr>
-          <w:p>
-            <w:pPr>
-              <w:widowControl w:val="0"/>
-              <w:spacing w:line="240" w:lineRule="auto"/>
-            </w:pPr>
-            <w:r>
-              <w:t>R.F.5</w:t>
-            </w:r>
-          </w:p>
-        </w:tc>
-        <w:tc>
-          <w:tcPr>
-            <w:tcW w:w="3165" w:type="dxa"/>
-            <w:gridSpan w:val="2"/>
-            <w:shd w:val="clear" w:color="auto" w:fill="auto"/>
-            <w:tcMar>
-              <w:top w:w="100" w:type="dxa"/>
-              <w:left w:w="100" w:type="dxa"/>
-              <w:bottom w:w="100" w:type="dxa"/>
-              <w:right w:w="100" w:type="dxa"/>
-            </w:tcMar>
-          </w:tcPr>
-          <w:p>
-            <w:pPr>
-              <w:widowControl w:val="0"/>
-              <w:spacing w:line="240" w:lineRule="auto"/>
-              <w:jc w:val="center"/>
-            </w:pPr>
-            <w:r>
-              <w:t>Eliminar libro</w:t>
-            </w:r>
-          </w:p>
-        </w:tc>
-        <w:tc>
-          <w:tcPr>
-            <w:tcW w:w="1965" w:type="dxa"/>
-            <w:shd w:val="clear" w:color="auto" w:fill="auto"/>
-            <w:tcMar>
-              <w:top w:w="100" w:type="dxa"/>
-              <w:left w:w="100" w:type="dxa"/>
-              <w:bottom w:w="100" w:type="dxa"/>
-              <w:right w:w="100" w:type="dxa"/>
-            </w:tcMar>
-          </w:tcPr>
-          <w:p>
-            <w:pPr>
-              <w:widowControl w:val="0"/>
-              <w:spacing w:line="240" w:lineRule="auto"/>
-            </w:pPr>
-            <w:r>
-              <w:t>0</w:t>
-            </w:r>
-            <w:r>
-              <w:t>7</w:t>
-            </w:r>
-            <w:r>
-              <w:t>/07/2025</w:t>
-            </w:r>
-          </w:p>
-        </w:tc>
-        <w:tc>
-          <w:tcPr>
-            <w:tcW w:w="2385" w:type="dxa"/>
-            <w:shd w:val="clear" w:color="auto" w:fill="auto"/>
-            <w:tcMar>
-              <w:top w:w="100" w:type="dxa"/>
-              <w:left w:w="100" w:type="dxa"/>
-              <w:bottom w:w="100" w:type="dxa"/>
-              <w:right w:w="100" w:type="dxa"/>
-            </w:tcMar>
-          </w:tcPr>
-          <w:p>
-            <w:pPr>
-              <w:widowControl w:val="0"/>
-              <w:spacing w:line="240" w:lineRule="auto"/>
-            </w:pPr>
-            <w:r>
-              <w:t>Importante</w:t>
-            </w:r>
-          </w:p>
-        </w:tc>
-      </w:tr>
-      <w:tr>
-        <w:trPr>
-          <w:trHeight w:val="420"/>
-        </w:trPr>
-        <w:tc>
-          <w:tcPr>
-            <w:tcW w:w="2100" w:type="dxa"/>
-            <w:shd w:val="clear" w:color="auto" w:fill="D9D9D9"/>
-            <w:tcMar>
-              <w:top w:w="100" w:type="dxa"/>
-              <w:left w:w="100" w:type="dxa"/>
-              <w:bottom w:w="100" w:type="dxa"/>
-              <w:right w:w="100" w:type="dxa"/>
-            </w:tcMar>
-          </w:tcPr>
-          <w:p>
-            <w:pPr>
-              <w:widowControl w:val="0"/>
-              <w:spacing w:line="240" w:lineRule="auto"/>
-              <w:rPr>
-                <w:b/>
-              </w:rPr>
-            </w:pPr>
-            <w:r>
-              <w:rPr>
-                <w:b/>
-              </w:rPr>
-              <w:t>Descripción</w:t>
-            </w:r>
-          </w:p>
-        </w:tc>
-        <w:tc>
-          <w:tcPr>
-            <w:tcW w:w="7515" w:type="dxa"/>
-            <w:gridSpan w:val="4"/>
-            <w:shd w:val="clear" w:color="auto" w:fill="auto"/>
-            <w:tcMar>
-              <w:top w:w="100" w:type="dxa"/>
-              <w:left w:w="100" w:type="dxa"/>
-              <w:bottom w:w="100" w:type="dxa"/>
-              <w:right w:w="100" w:type="dxa"/>
-            </w:tcMar>
-          </w:tcPr>
-          <w:p>
-            <w:pPr>
-              <w:widowControl w:val="0"/>
-              <w:spacing w:line="240" w:lineRule="auto"/>
-            </w:pPr>
-            <w:r>
-              <w:t>Permite eliminar lógicamente un libro del sistema (cambiando su estado a inactivo) para evitar que esté disponible para nuevos préstamos, sin borrar su historial.</w:t>
-            </w:r>
-          </w:p>
-        </w:tc>
-      </w:tr>
-      <w:tr>
-        <w:tc>
-          <w:tcPr>
-            <w:tcW w:w="2100" w:type="dxa"/>
-            <w:shd w:val="clear" w:color="auto" w:fill="D9D9D9"/>
-            <w:tcMar>
-              <w:top w:w="100" w:type="dxa"/>
-              <w:left w:w="100" w:type="dxa"/>
-              <w:bottom w:w="100" w:type="dxa"/>
-              <w:right w:w="100" w:type="dxa"/>
-            </w:tcMar>
-          </w:tcPr>
-          <w:p>
-            <w:pPr>
-              <w:widowControl w:val="0"/>
-              <w:spacing w:line="240" w:lineRule="auto"/>
-              <w:rPr>
-                <w:b/>
-              </w:rPr>
-            </w:pPr>
-            <w:r>
-              <w:rPr>
-                <w:b/>
-              </w:rPr>
-              <w:t>Entradas</w:t>
-            </w:r>
-          </w:p>
-        </w:tc>
-        <w:tc>
-          <w:tcPr>
-            <w:tcW w:w="1650" w:type="dxa"/>
-            <w:shd w:val="clear" w:color="auto" w:fill="D9D9D9"/>
-            <w:tcMar>
-              <w:top w:w="100" w:type="dxa"/>
-              <w:left w:w="100" w:type="dxa"/>
-              <w:bottom w:w="100" w:type="dxa"/>
-              <w:right w:w="100" w:type="dxa"/>
-            </w:tcMar>
-          </w:tcPr>
-          <w:p>
-            <w:pPr>
-              <w:widowControl w:val="0"/>
-              <w:spacing w:line="240" w:lineRule="auto"/>
-              <w:rPr>
-                <w:b/>
-              </w:rPr>
-            </w:pPr>
-            <w:r>
-              <w:rPr>
-                <w:b/>
-              </w:rPr>
-              <w:t>Fuente</w:t>
-            </w:r>
-          </w:p>
-        </w:tc>
-        <w:tc>
-          <w:tcPr>
-            <w:tcW w:w="1515" w:type="dxa"/>
-            <w:shd w:val="clear" w:color="auto" w:fill="D9D9D9"/>
-            <w:tcMar>
-              <w:top w:w="100" w:type="dxa"/>
-              <w:left w:w="100" w:type="dxa"/>
-              <w:bottom w:w="100" w:type="dxa"/>
-              <w:right w:w="100" w:type="dxa"/>
-            </w:tcMar>
-          </w:tcPr>
-          <w:p>
-            <w:pPr>
-              <w:widowControl w:val="0"/>
-              <w:spacing w:line="240" w:lineRule="auto"/>
-              <w:rPr>
-                <w:b/>
-              </w:rPr>
-            </w:pPr>
-            <w:r>
-              <w:rPr>
-                <w:b/>
-              </w:rPr>
-              <w:t>Salida</w:t>
-            </w:r>
-          </w:p>
-        </w:tc>
-        <w:tc>
-          <w:tcPr>
-            <w:tcW w:w="1965" w:type="dxa"/>
-            <w:shd w:val="clear" w:color="auto" w:fill="D9D9D9"/>
-            <w:tcMar>
-              <w:top w:w="100" w:type="dxa"/>
-              <w:left w:w="100" w:type="dxa"/>
-              <w:bottom w:w="100" w:type="dxa"/>
-              <w:right w:w="100" w:type="dxa"/>
-            </w:tcMar>
-          </w:tcPr>
-          <w:p>
-            <w:pPr>
-              <w:widowControl w:val="0"/>
-              <w:spacing w:line="240" w:lineRule="auto"/>
-              <w:rPr>
-                <w:b/>
-              </w:rPr>
-            </w:pPr>
-            <w:r>
-              <w:rPr>
-                <w:b/>
-              </w:rPr>
-              <w:t>Destino</w:t>
-            </w:r>
-          </w:p>
-        </w:tc>
-        <w:tc>
-          <w:tcPr>
-            <w:tcW w:w="2385" w:type="dxa"/>
-            <w:shd w:val="clear" w:color="auto" w:fill="D9D9D9"/>
-            <w:tcMar>
-              <w:top w:w="100" w:type="dxa"/>
-              <w:left w:w="100" w:type="dxa"/>
-              <w:bottom w:w="100" w:type="dxa"/>
-              <w:right w:w="100" w:type="dxa"/>
-            </w:tcMar>
-          </w:tcPr>
-          <w:p>
-            <w:pPr>
-              <w:widowControl w:val="0"/>
-              <w:spacing w:line="240" w:lineRule="auto"/>
-              <w:rPr>
-                <w:b/>
-              </w:rPr>
-            </w:pPr>
-            <w:r>
-              <w:rPr>
-                <w:b/>
-              </w:rPr>
-              <w:t>Restricciones</w:t>
-            </w:r>
-          </w:p>
-        </w:tc>
-      </w:tr>
-      <w:tr>
-        <w:tc>
-          <w:tcPr>
-            <w:tcW w:w="2100" w:type="dxa"/>
-            <w:shd w:val="clear" w:color="auto" w:fill="auto"/>
-            <w:tcMar>
-              <w:top w:w="100" w:type="dxa"/>
-              <w:left w:w="100" w:type="dxa"/>
-              <w:bottom w:w="100" w:type="dxa"/>
-              <w:right w:w="100" w:type="dxa"/>
-            </w:tcMar>
-          </w:tcPr>
-          <w:p>
-            <w:pPr>
-              <w:widowControl w:val="0"/>
-              <w:numPr>
-                <w:ilvl w:val="0"/>
-                <w:numId w:val="1"/>
-              </w:numPr>
-              <w:spacing w:line="240" w:lineRule="auto"/>
-            </w:pPr>
-            <w:r>
-              <w:t xml:space="preserve">Libro seleccionado </w:t>
-            </w:r>
-          </w:p>
-          <w:p>
-            <w:pPr>
-              <w:widowControl w:val="0"/>
-              <w:numPr>
-                <w:ilvl w:val="0"/>
-                <w:numId w:val="1"/>
-              </w:numPr>
-              <w:spacing w:line="240" w:lineRule="auto"/>
-            </w:pPr>
-            <w:r>
-              <w:t>Contraseña de director o Root</w:t>
-            </w:r>
-            <w:r>
-              <w:t xml:space="preserve"> </w:t>
-            </w:r>
-            <w:r>
-              <w:t xml:space="preserve">  </w:t>
-            </w:r>
-          </w:p>
-        </w:tc>
-        <w:tc>
-          <w:tcPr>
-            <w:tcW w:w="1650" w:type="dxa"/>
-            <w:shd w:val="clear" w:color="auto" w:fill="auto"/>
-            <w:tcMar>
-              <w:top w:w="100" w:type="dxa"/>
-              <w:left w:w="100" w:type="dxa"/>
-              <w:bottom w:w="100" w:type="dxa"/>
-              <w:right w:w="100" w:type="dxa"/>
-            </w:tcMar>
-          </w:tcPr>
-          <w:p>
-            <w:pPr>
-              <w:widowControl w:val="0"/>
-              <w:spacing w:line="240" w:lineRule="auto"/>
-            </w:pPr>
-            <w:r>
-              <w:t>Maestro autenticado con permisos de acceso, validado por credenciales del director o root.</w:t>
-            </w:r>
-          </w:p>
-        </w:tc>
-        <w:tc>
-          <w:tcPr>
-            <w:tcW w:w="1515" w:type="dxa"/>
-            <w:shd w:val="clear" w:color="auto" w:fill="auto"/>
-            <w:tcMar>
-              <w:top w:w="100" w:type="dxa"/>
-              <w:left w:w="100" w:type="dxa"/>
-              <w:bottom w:w="100" w:type="dxa"/>
-              <w:right w:w="100" w:type="dxa"/>
-            </w:tcMar>
-          </w:tcPr>
-          <w:p>
-            <w:pPr>
-              <w:widowControl w:val="0"/>
-              <w:spacing w:line="240" w:lineRule="auto"/>
-            </w:pPr>
-            <w:r>
-              <w:t>Mensaje de confirmación o error en pantalla.</w:t>
-            </w:r>
-          </w:p>
-          <w:p>
-            <w:pPr>
-              <w:widowControl w:val="0"/>
-              <w:spacing w:line="240" w:lineRule="auto"/>
-            </w:pPr>
-          </w:p>
-          <w:p>
-            <w:pPr>
-              <w:widowControl w:val="0"/>
-              <w:spacing w:line="240" w:lineRule="auto"/>
-            </w:pPr>
-            <w:r>
-              <w:t xml:space="preserve">Actualización </w:t>
-            </w:r>
-            <w:r>
-              <w:t xml:space="preserve">logica del registro </w:t>
-            </w:r>
-          </w:p>
-          <w:p>
-            <w:pPr>
-              <w:widowControl w:val="0"/>
-              <w:spacing w:line="240" w:lineRule="auto"/>
-            </w:pPr>
-          </w:p>
-        </w:tc>
-        <w:tc>
-          <w:tcPr>
-            <w:tcW w:w="1965" w:type="dxa"/>
-            <w:shd w:val="clear" w:color="auto" w:fill="auto"/>
-            <w:tcMar>
-              <w:top w:w="100" w:type="dxa"/>
-              <w:left w:w="100" w:type="dxa"/>
-              <w:bottom w:w="100" w:type="dxa"/>
-              <w:right w:w="100" w:type="dxa"/>
-            </w:tcMar>
-          </w:tcPr>
-          <w:p>
-            <w:pPr>
-              <w:widowControl w:val="0"/>
-              <w:spacing w:line="240" w:lineRule="auto"/>
-            </w:pPr>
-            <w:r>
-              <w:t>Interfaz gráfica</w:t>
-            </w:r>
-          </w:p>
-          <w:p>
-            <w:pPr>
-              <w:widowControl w:val="0"/>
-              <w:spacing w:line="240" w:lineRule="auto"/>
-            </w:pPr>
-          </w:p>
-          <w:p>
-            <w:pPr>
-              <w:widowControl w:val="0"/>
-              <w:spacing w:line="240" w:lineRule="auto"/>
-            </w:pPr>
-            <w:r>
-              <w:t>T</w:t>
-            </w:r>
-            <w:r>
-              <w:t xml:space="preserve">abla </w:t>
-            </w:r>
-            <w:r>
-              <w:t>libros</w:t>
-            </w:r>
-          </w:p>
-        </w:tc>
-        <w:tc>
-          <w:tcPr>
-            <w:tcW w:w="2385" w:type="dxa"/>
-            <w:shd w:val="clear" w:color="auto" w:fill="auto"/>
-            <w:tcMar>
-              <w:top w:w="100" w:type="dxa"/>
-              <w:left w:w="100" w:type="dxa"/>
-              <w:bottom w:w="100" w:type="dxa"/>
-              <w:right w:w="100" w:type="dxa"/>
-            </w:tcMar>
-          </w:tcPr>
-          <w:p>
-            <w:pPr>
-              <w:pStyle w:val="Prrafodelista"/>
-              <w:widowControl w:val="0"/>
-              <w:numPr>
-                <w:ilvl w:val="0"/>
-                <w:numId w:val="18"/>
-              </w:numPr>
-              <w:rPr>
-                <w:lang w:val="es-MX"/>
-              </w:rPr>
-            </w:pPr>
-            <w:r>
-              <w:rPr>
-                <w:lang w:val="es-MX"/>
-              </w:rPr>
-              <w:t xml:space="preserve"> El libro debe estar activo</w:t>
-            </w:r>
-          </w:p>
-          <w:p>
-            <w:pPr>
-              <w:pStyle w:val="Prrafodelista"/>
-              <w:widowControl w:val="0"/>
-              <w:numPr>
-                <w:ilvl w:val="0"/>
-                <w:numId w:val="18"/>
-              </w:numPr>
-              <w:rPr>
-                <w:lang w:val="es-MX"/>
-              </w:rPr>
-            </w:pPr>
-            <w:r>
-              <w:rPr>
-                <w:lang w:val="es-MX"/>
-              </w:rPr>
-              <w:t>El usuario debe estar autenticado</w:t>
-            </w:r>
-          </w:p>
-          <w:p>
-            <w:pPr>
-              <w:pStyle w:val="Prrafodelista"/>
-              <w:widowControl w:val="0"/>
-              <w:numPr>
-                <w:ilvl w:val="0"/>
-                <w:numId w:val="18"/>
-              </w:numPr>
-              <w:rPr>
-                <w:lang w:val="es-MX"/>
-              </w:rPr>
-            </w:pPr>
-            <w:r>
-              <w:rPr>
-                <w:lang w:val="es-MX"/>
-              </w:rPr>
-              <w:t>Se debe ingresar correctamente la contraseña de validación</w:t>
-            </w:r>
-          </w:p>
-          <w:p>
-            <w:pPr>
-              <w:widowControl w:val="0"/>
-              <w:spacing w:line="240" w:lineRule="auto"/>
-              <w:rPr>
-                <w:lang w:val="es-MX"/>
-              </w:rPr>
-            </w:pPr>
-          </w:p>
-          <w:p>
-            <w:pPr>
-              <w:widowControl w:val="0"/>
-              <w:spacing w:line="240" w:lineRule="auto"/>
-            </w:pPr>
-          </w:p>
-        </w:tc>
-      </w:tr>
-      <w:tr>
-        <w:trPr>
-          <w:trHeight w:val="420"/>
-        </w:trPr>
-        <w:tc>
-          <w:tcPr>
-            <w:tcW w:w="2100" w:type="dxa"/>
-            <w:shd w:val="clear" w:color="auto" w:fill="D9D9D9"/>
-            <w:tcMar>
-              <w:top w:w="100" w:type="dxa"/>
-              <w:left w:w="100" w:type="dxa"/>
-              <w:bottom w:w="100" w:type="dxa"/>
-              <w:right w:w="100" w:type="dxa"/>
-            </w:tcMar>
-          </w:tcPr>
-          <w:p>
-            <w:pPr>
-              <w:widowControl w:val="0"/>
-              <w:spacing w:line="240" w:lineRule="auto"/>
-              <w:rPr>
-                <w:b/>
-              </w:rPr>
-            </w:pPr>
-            <w:r>
-              <w:rPr>
-                <w:b/>
-              </w:rPr>
-              <w:t>Proceso</w:t>
-            </w:r>
-          </w:p>
-        </w:tc>
-        <w:tc>
-          <w:tcPr>
-            <w:tcW w:w="7515" w:type="dxa"/>
-            <w:gridSpan w:val="4"/>
-            <w:shd w:val="clear" w:color="auto" w:fill="auto"/>
-            <w:tcMar>
-              <w:top w:w="100" w:type="dxa"/>
-              <w:left w:w="100" w:type="dxa"/>
-              <w:bottom w:w="100" w:type="dxa"/>
-              <w:right w:w="100" w:type="dxa"/>
-            </w:tcMar>
-          </w:tcPr>
-          <w:p>
-            <w:pPr>
-              <w:pStyle w:val="Prrafodelista"/>
-              <w:widowControl w:val="0"/>
-              <w:numPr>
-                <w:ilvl w:val="0"/>
-                <w:numId w:val="19"/>
-              </w:numPr>
-              <w:spacing w:line="240" w:lineRule="auto"/>
-            </w:pPr>
-            <w:r>
-              <w:t>Se selecciona el libro</w:t>
-            </w:r>
-          </w:p>
-          <w:p>
-            <w:pPr>
-              <w:pStyle w:val="Prrafodelista"/>
-              <w:widowControl w:val="0"/>
-              <w:numPr>
-                <w:ilvl w:val="0"/>
-                <w:numId w:val="19"/>
-              </w:numPr>
-              <w:spacing w:line="240" w:lineRule="auto"/>
-            </w:pPr>
-            <w:r>
-              <w:t>Se da click en el boton de eliminar libro</w:t>
-            </w:r>
-          </w:p>
-          <w:p>
-            <w:pPr>
-              <w:pStyle w:val="Prrafodelista"/>
-              <w:widowControl w:val="0"/>
-              <w:numPr>
-                <w:ilvl w:val="0"/>
-                <w:numId w:val="19"/>
-              </w:numPr>
-              <w:spacing w:line="240" w:lineRule="auto"/>
-            </w:pPr>
-            <w:r>
-              <w:t>Se solicita contraseña del root/director</w:t>
-            </w:r>
-          </w:p>
-          <w:p>
-            <w:pPr>
-              <w:pStyle w:val="Prrafodelista"/>
-              <w:widowControl w:val="0"/>
-              <w:numPr>
-                <w:ilvl w:val="0"/>
-                <w:numId w:val="19"/>
-              </w:numPr>
-              <w:spacing w:line="240" w:lineRule="auto"/>
-            </w:pPr>
-            <w:r>
-              <w:t>Se valida la contraseña</w:t>
-            </w:r>
-          </w:p>
-          <w:p>
-            <w:pPr>
-              <w:pStyle w:val="Prrafodelista"/>
-              <w:widowControl w:val="0"/>
-              <w:numPr>
-                <w:ilvl w:val="0"/>
-                <w:numId w:val="19"/>
-              </w:numPr>
-              <w:spacing w:line="240" w:lineRule="auto"/>
-            </w:pPr>
-            <w:r>
-              <w:t>El libro se marca como inactivo en base de datos</w:t>
-            </w:r>
-          </w:p>
-          <w:p>
-            <w:pPr>
-              <w:pStyle w:val="Prrafodelista"/>
-              <w:widowControl w:val="0"/>
-              <w:numPr>
-                <w:ilvl w:val="0"/>
-                <w:numId w:val="19"/>
-              </w:numPr>
-              <w:spacing w:line="240" w:lineRule="auto"/>
-            </w:pPr>
-            <w:r>
-              <w:t xml:space="preserve">Se muestra un mensaje de confirmación o error </w:t>
-            </w:r>
-          </w:p>
-        </w:tc>
-      </w:tr>
-      <w:tr>
-        <w:trPr>
-          <w:trHeight w:val="420"/>
-        </w:trPr>
-        <w:tc>
-          <w:tcPr>
-            <w:tcW w:w="2100" w:type="dxa"/>
-            <w:shd w:val="clear" w:color="auto" w:fill="D9D9D9"/>
-            <w:tcMar>
-              <w:top w:w="100" w:type="dxa"/>
-              <w:left w:w="100" w:type="dxa"/>
-              <w:bottom w:w="100" w:type="dxa"/>
-              <w:right w:w="100" w:type="dxa"/>
-            </w:tcMar>
-          </w:tcPr>
-          <w:p>
-            <w:pPr>
-              <w:widowControl w:val="0"/>
-              <w:spacing w:line="240" w:lineRule="auto"/>
-              <w:rPr>
-                <w:b/>
-              </w:rPr>
-            </w:pPr>
-            <w:r>
-              <w:rPr>
-                <w:b/>
-              </w:rPr>
-              <w:t>Efecto Colateral</w:t>
-            </w:r>
-          </w:p>
-        </w:tc>
-        <w:tc>
-          <w:tcPr>
-            <w:tcW w:w="7515" w:type="dxa"/>
-            <w:gridSpan w:val="4"/>
-            <w:shd w:val="clear" w:color="auto" w:fill="auto"/>
-            <w:tcMar>
-              <w:top w:w="100" w:type="dxa"/>
-              <w:left w:w="100" w:type="dxa"/>
-              <w:bottom w:w="100" w:type="dxa"/>
-              <w:right w:w="100" w:type="dxa"/>
-            </w:tcMar>
-          </w:tcPr>
-          <w:p>
-            <w:pPr>
-              <w:pStyle w:val="Prrafodelista"/>
-              <w:widowControl w:val="0"/>
-              <w:numPr>
-                <w:ilvl w:val="0"/>
-                <w:numId w:val="13"/>
-              </w:numPr>
-              <w:spacing w:line="240" w:lineRule="auto"/>
-            </w:pPr>
-            <w:r>
-              <w:t>Se quita la disponibilidad de los libros para su prestamo</w:t>
-            </w:r>
+              <w:t xml:space="preserve">Se quita la disponibilidad de los libros para su </w:t>
+            </w:r>
+            <w:proofErr w:type="spellStart"/>
+            <w:r>
+              <w:t>prestamo</w:t>
+            </w:r>
+            <w:proofErr w:type="spellEnd"/>
           </w:p>
           <w:p>
             <w:pPr>
@@ -4936,7 +5080,6 @@
         <w:tc>
           <w:tcPr>
             <w:tcW w:w="2100" w:type="dxa"/>
-            <w:shd w:val="clear" w:color="auto" w:fill="auto"/>
             <w:tcMar>
               <w:top w:w="100" w:type="dxa"/>
               <w:left w:w="100" w:type="dxa"/>
@@ -4958,7 +5101,6 @@
           <w:tcPr>
             <w:tcW w:w="3165" w:type="dxa"/>
             <w:gridSpan w:val="2"/>
-            <w:shd w:val="clear" w:color="auto" w:fill="auto"/>
             <w:tcMar>
               <w:top w:w="100" w:type="dxa"/>
               <w:left w:w="100" w:type="dxa"/>
@@ -4980,7 +5122,6 @@
         <w:tc>
           <w:tcPr>
             <w:tcW w:w="1965" w:type="dxa"/>
-            <w:shd w:val="clear" w:color="auto" w:fill="auto"/>
             <w:tcMar>
               <w:top w:w="100" w:type="dxa"/>
               <w:left w:w="100" w:type="dxa"/>
@@ -5001,7 +5142,6 @@
         <w:tc>
           <w:tcPr>
             <w:tcW w:w="2385" w:type="dxa"/>
-            <w:shd w:val="clear" w:color="auto" w:fill="auto"/>
             <w:tcMar>
               <w:top w:w="100" w:type="dxa"/>
               <w:left w:w="100" w:type="dxa"/>
@@ -5055,7 +5195,6 @@
           <w:tcPr>
             <w:tcW w:w="7515" w:type="dxa"/>
             <w:gridSpan w:val="4"/>
-            <w:shd w:val="clear" w:color="auto" w:fill="auto"/>
             <w:tcMar>
               <w:top w:w="100" w:type="dxa"/>
               <w:left w:w="100" w:type="dxa"/>
@@ -5221,7 +5360,6 @@
         <w:tc>
           <w:tcPr>
             <w:tcW w:w="2100" w:type="dxa"/>
-            <w:shd w:val="clear" w:color="auto" w:fill="auto"/>
             <w:tcMar>
               <w:top w:w="100" w:type="dxa"/>
               <w:left w:w="100" w:type="dxa"/>
@@ -5311,28 +5449,34 @@
         <w:tc>
           <w:tcPr>
             <w:tcW w:w="1650" w:type="dxa"/>
-            <w:shd w:val="clear" w:color="auto" w:fill="auto"/>
-            <w:tcMar>
-              <w:top w:w="100" w:type="dxa"/>
-              <w:left w:w="100" w:type="dxa"/>
-              <w:bottom w:w="100" w:type="dxa"/>
-              <w:right w:w="100" w:type="dxa"/>
-            </w:tcMar>
-          </w:tcPr>
-          <w:p>
-            <w:pPr>
-              <w:widowControl w:val="0"/>
-              <w:spacing w:line="240" w:lineRule="auto"/>
-            </w:pPr>
-            <w:r>
-              <w:t>Maestro/Director/Root con la información del alumno</w:t>
+            <w:tcMar>
+              <w:top w:w="100" w:type="dxa"/>
+              <w:left w:w="100" w:type="dxa"/>
+              <w:bottom w:w="100" w:type="dxa"/>
+              <w:right w:w="100" w:type="dxa"/>
+            </w:tcMar>
+          </w:tcPr>
+          <w:p>
+            <w:pPr>
+              <w:widowControl w:val="0"/>
+              <w:spacing w:line="240" w:lineRule="auto"/>
+            </w:pPr>
+            <w:r>
+              <w:t>Maestro/</w:t>
+            </w:r>
+            <w:proofErr w:type="gramStart"/>
+            <w:r>
+              <w:t>Director</w:t>
+            </w:r>
+            <w:proofErr w:type="gramEnd"/>
+            <w:r>
+              <w:t>/Root con la información del alumno</w:t>
             </w:r>
           </w:p>
         </w:tc>
         <w:tc>
           <w:tcPr>
             <w:tcW w:w="1515" w:type="dxa"/>
-            <w:shd w:val="clear" w:color="auto" w:fill="auto"/>
             <w:tcMar>
               <w:top w:w="100" w:type="dxa"/>
               <w:left w:w="100" w:type="dxa"/>
@@ -5389,7 +5533,6 @@
         <w:tc>
           <w:tcPr>
             <w:tcW w:w="1965" w:type="dxa"/>
-            <w:shd w:val="clear" w:color="auto" w:fill="auto"/>
             <w:tcMar>
               <w:top w:w="100" w:type="dxa"/>
               <w:left w:w="100" w:type="dxa"/>
@@ -5425,7 +5568,6 @@
         <w:tc>
           <w:tcPr>
             <w:tcW w:w="2385" w:type="dxa"/>
-            <w:shd w:val="clear" w:color="auto" w:fill="auto"/>
             <w:tcMar>
               <w:top w:w="100" w:type="dxa"/>
               <w:left w:w="100" w:type="dxa"/>
@@ -5523,7 +5665,6 @@
           <w:tcPr>
             <w:tcW w:w="7515" w:type="dxa"/>
             <w:gridSpan w:val="4"/>
-            <w:shd w:val="clear" w:color="auto" w:fill="auto"/>
             <w:tcMar>
               <w:top w:w="100" w:type="dxa"/>
               <w:left w:w="100" w:type="dxa"/>
@@ -5682,7 +5823,6 @@
           <w:tcPr>
             <w:tcW w:w="7515" w:type="dxa"/>
             <w:gridSpan w:val="4"/>
-            <w:shd w:val="clear" w:color="auto" w:fill="auto"/>
             <w:tcMar>
               <w:top w:w="100" w:type="dxa"/>
               <w:left w:w="100" w:type="dxa"/>
@@ -5940,7 +6080,6 @@
         <w:tc>
           <w:tcPr>
             <w:tcW w:w="2100" w:type="dxa"/>
-            <w:shd w:val="clear" w:color="auto" w:fill="auto"/>
             <w:tcMar>
               <w:top w:w="100" w:type="dxa"/>
               <w:left w:w="100" w:type="dxa"/>
@@ -5965,7 +6104,6 @@
           <w:tcPr>
             <w:tcW w:w="3165" w:type="dxa"/>
             <w:gridSpan w:val="2"/>
-            <w:shd w:val="clear" w:color="auto" w:fill="auto"/>
             <w:tcMar>
               <w:top w:w="100" w:type="dxa"/>
               <w:left w:w="100" w:type="dxa"/>
@@ -5987,7 +6125,6 @@
         <w:tc>
           <w:tcPr>
             <w:tcW w:w="1965" w:type="dxa"/>
-            <w:shd w:val="clear" w:color="auto" w:fill="auto"/>
             <w:tcMar>
               <w:top w:w="100" w:type="dxa"/>
               <w:left w:w="100" w:type="dxa"/>
@@ -6011,7 +6148,6 @@
         <w:tc>
           <w:tcPr>
             <w:tcW w:w="2385" w:type="dxa"/>
-            <w:shd w:val="clear" w:color="auto" w:fill="auto"/>
             <w:tcMar>
               <w:top w:w="100" w:type="dxa"/>
               <w:left w:w="100" w:type="dxa"/>
@@ -6068,7 +6204,6 @@
           <w:tcPr>
             <w:tcW w:w="7515" w:type="dxa"/>
             <w:gridSpan w:val="4"/>
-            <w:shd w:val="clear" w:color="auto" w:fill="auto"/>
             <w:tcMar>
               <w:top w:w="100" w:type="dxa"/>
               <w:left w:w="100" w:type="dxa"/>
@@ -6234,7 +6369,6 @@
         <w:tc>
           <w:tcPr>
             <w:tcW w:w="2100" w:type="dxa"/>
-            <w:shd w:val="clear" w:color="auto" w:fill="auto"/>
             <w:tcMar>
               <w:top w:w="100" w:type="dxa"/>
               <w:left w:w="100" w:type="dxa"/>
@@ -6263,8 +6397,13 @@
               <w:spacing w:line="240" w:lineRule="auto"/>
             </w:pPr>
             <w:r>
-              <w:t>Contraseña del director/root</w:t>
-            </w:r>
+              <w:t>Contraseña del director/</w:t>
+            </w:r>
+            <w:proofErr w:type="spellStart"/>
+            <w:r>
+              <w:t>root</w:t>
+            </w:r>
+            <w:proofErr w:type="spellEnd"/>
           </w:p>
           <w:p>
             <w:pPr>
@@ -6282,28 +6421,34 @@
         <w:tc>
           <w:tcPr>
             <w:tcW w:w="1650" w:type="dxa"/>
-            <w:shd w:val="clear" w:color="auto" w:fill="auto"/>
-            <w:tcMar>
-              <w:top w:w="100" w:type="dxa"/>
-              <w:left w:w="100" w:type="dxa"/>
-              <w:bottom w:w="100" w:type="dxa"/>
-              <w:right w:w="100" w:type="dxa"/>
-            </w:tcMar>
-          </w:tcPr>
-          <w:p>
-            <w:pPr>
-              <w:widowControl w:val="0"/>
-              <w:spacing w:line="240" w:lineRule="auto"/>
-            </w:pPr>
-            <w:r>
-              <w:t>Usuario del sistema con autorización del Director/Root</w:t>
+            <w:tcMar>
+              <w:top w:w="100" w:type="dxa"/>
+              <w:left w:w="100" w:type="dxa"/>
+              <w:bottom w:w="100" w:type="dxa"/>
+              <w:right w:w="100" w:type="dxa"/>
+            </w:tcMar>
+          </w:tcPr>
+          <w:p>
+            <w:pPr>
+              <w:widowControl w:val="0"/>
+              <w:spacing w:line="240" w:lineRule="auto"/>
+            </w:pPr>
+            <w:r>
+              <w:t xml:space="preserve">Usuario del sistema con autorización del </w:t>
+            </w:r>
+            <w:proofErr w:type="gramStart"/>
+            <w:r>
+              <w:t>Director</w:t>
+            </w:r>
+            <w:proofErr w:type="gramEnd"/>
+            <w:r>
+              <w:t>/Root</w:t>
             </w:r>
           </w:p>
         </w:tc>
         <w:tc>
           <w:tcPr>
             <w:tcW w:w="1515" w:type="dxa"/>
-            <w:shd w:val="clear" w:color="auto" w:fill="auto"/>
             <w:tcMar>
               <w:top w:w="100" w:type="dxa"/>
               <w:left w:w="100" w:type="dxa"/>
@@ -6336,7 +6481,6 @@
         <w:tc>
           <w:tcPr>
             <w:tcW w:w="1965" w:type="dxa"/>
-            <w:shd w:val="clear" w:color="auto" w:fill="auto"/>
             <w:tcMar>
               <w:top w:w="100" w:type="dxa"/>
               <w:left w:w="100" w:type="dxa"/>
@@ -6356,7 +6500,21 @@
               <w:rPr>
                 <w:lang w:val="es-MX"/>
               </w:rPr>
-              <w:t>Interfaz gráfica (feedback) y tabla alumnos (registros modificados)</w:t>
+              <w:t>Interfaz gráfica (</w:t>
+            </w:r>
+            <w:proofErr w:type="spellStart"/>
+            <w:r>
+              <w:rPr>
+                <w:lang w:val="es-MX"/>
+              </w:rPr>
+              <w:t>feedback</w:t>
+            </w:r>
+            <w:proofErr w:type="spellEnd"/>
+            <w:r>
+              <w:rPr>
+                <w:lang w:val="es-MX"/>
+              </w:rPr>
+              <w:t>) y tabla alumnos (registros modificados)</w:t>
             </w:r>
           </w:p>
           <w:p>
@@ -6369,7 +6527,6 @@
         <w:tc>
           <w:tcPr>
             <w:tcW w:w="2385" w:type="dxa"/>
-            <w:shd w:val="clear" w:color="auto" w:fill="auto"/>
             <w:tcMar>
               <w:top w:w="100" w:type="dxa"/>
               <w:left w:w="100" w:type="dxa"/>
@@ -6406,8 +6563,16 @@
               <w:rPr>
                 <w:lang w:val="es-MX"/>
               </w:rPr>
-              <w:t xml:space="preserve"> director o root</w:t>
-            </w:r>
+              <w:t xml:space="preserve"> director o </w:t>
+            </w:r>
+            <w:proofErr w:type="spellStart"/>
+            <w:r>
+              <w:rPr>
+                <w:lang w:val="es-MX"/>
+              </w:rPr>
+              <w:t>root</w:t>
+            </w:r>
+            <w:proofErr w:type="spellEnd"/>
           </w:p>
           <w:p>
             <w:pPr>
@@ -6452,7 +6617,6 @@
           <w:tcPr>
             <w:tcW w:w="7515" w:type="dxa"/>
             <w:gridSpan w:val="4"/>
-            <w:shd w:val="clear" w:color="auto" w:fill="auto"/>
             <w:tcMar>
               <w:top w:w="100" w:type="dxa"/>
               <w:left w:w="100" w:type="dxa"/>
@@ -6514,8 +6678,16 @@
               <w:rPr>
                 <w:lang w:val="es-MX"/>
               </w:rPr>
-              <w:t>Se solicita la contraseña del director/root</w:t>
-            </w:r>
+              <w:t>Se solicita la contraseña del director/</w:t>
+            </w:r>
+            <w:proofErr w:type="spellStart"/>
+            <w:r>
+              <w:rPr>
+                <w:lang w:val="es-MX"/>
+              </w:rPr>
+              <w:t>root</w:t>
+            </w:r>
+            <w:proofErr w:type="spellEnd"/>
           </w:p>
           <w:p>
             <w:pPr>
@@ -6649,7 +6821,6 @@
           <w:tcPr>
             <w:tcW w:w="7515" w:type="dxa"/>
             <w:gridSpan w:val="4"/>
-            <w:shd w:val="clear" w:color="auto" w:fill="auto"/>
             <w:tcMar>
               <w:top w:w="100" w:type="dxa"/>
               <w:left w:w="100" w:type="dxa"/>
@@ -6907,7 +7078,6 @@
         <w:tc>
           <w:tcPr>
             <w:tcW w:w="2100" w:type="dxa"/>
-            <w:shd w:val="clear" w:color="auto" w:fill="auto"/>
             <w:tcMar>
               <w:top w:w="100" w:type="dxa"/>
               <w:left w:w="100" w:type="dxa"/>
@@ -6924,10 +7094,7 @@
               <w:spacing w:line="240" w:lineRule="auto"/>
             </w:pPr>
             <w:r>
-              <w:t>R.F.</w:t>
-            </w:r>
-            <w:r>
-              <w:t>8</w:t>
+              <w:t>R.F.8</w:t>
             </w:r>
           </w:p>
         </w:tc>
@@ -6935,7 +7102,6 @@
           <w:tcPr>
             <w:tcW w:w="3165" w:type="dxa"/>
             <w:gridSpan w:val="2"/>
-            <w:shd w:val="clear" w:color="auto" w:fill="auto"/>
             <w:tcMar>
               <w:top w:w="100" w:type="dxa"/>
               <w:left w:w="100" w:type="dxa"/>
@@ -6957,34 +7123,26 @@
         <w:tc>
           <w:tcPr>
             <w:tcW w:w="1965" w:type="dxa"/>
-            <w:shd w:val="clear" w:color="auto" w:fill="auto"/>
-            <w:tcMar>
-              <w:top w:w="100" w:type="dxa"/>
-              <w:left w:w="100" w:type="dxa"/>
-              <w:bottom w:w="100" w:type="dxa"/>
-              <w:right w:w="100" w:type="dxa"/>
-            </w:tcMar>
-          </w:tcPr>
-          <w:p>
-            <w:pPr>
-              <w:widowControl w:val="0"/>
-              <w:spacing w:line="240" w:lineRule="auto"/>
-            </w:pPr>
-            <w:r>
-              <w:t>1</w:t>
-            </w:r>
-            <w:r>
-              <w:t>1</w:t>
-            </w:r>
-            <w:r>
-              <w:t>/07/2025</w:t>
+            <w:tcMar>
+              <w:top w:w="100" w:type="dxa"/>
+              <w:left w:w="100" w:type="dxa"/>
+              <w:bottom w:w="100" w:type="dxa"/>
+              <w:right w:w="100" w:type="dxa"/>
+            </w:tcMar>
+          </w:tcPr>
+          <w:p>
+            <w:pPr>
+              <w:widowControl w:val="0"/>
+              <w:spacing w:line="240" w:lineRule="auto"/>
+            </w:pPr>
+            <w:r>
+              <w:t>11/07/2025</w:t>
             </w:r>
           </w:p>
         </w:tc>
         <w:tc>
           <w:tcPr>
             <w:tcW w:w="2385" w:type="dxa"/>
-            <w:shd w:val="clear" w:color="auto" w:fill="auto"/>
             <w:tcMar>
               <w:top w:w="100" w:type="dxa"/>
               <w:left w:w="100" w:type="dxa"/>
@@ -7038,7 +7196,6 @@
           <w:tcPr>
             <w:tcW w:w="7515" w:type="dxa"/>
             <w:gridSpan w:val="4"/>
-            <w:shd w:val="clear" w:color="auto" w:fill="auto"/>
             <w:tcMar>
               <w:top w:w="100" w:type="dxa"/>
               <w:left w:w="100" w:type="dxa"/>
@@ -7288,7 +7445,6 @@
         <w:tc>
           <w:tcPr>
             <w:tcW w:w="2100" w:type="dxa"/>
-            <w:shd w:val="clear" w:color="auto" w:fill="auto"/>
             <w:tcMar>
               <w:top w:w="100" w:type="dxa"/>
               <w:left w:w="100" w:type="dxa"/>
@@ -7309,28 +7465,39 @@
         <w:tc>
           <w:tcPr>
             <w:tcW w:w="1650" w:type="dxa"/>
-            <w:shd w:val="clear" w:color="auto" w:fill="auto"/>
-            <w:tcMar>
-              <w:top w:w="100" w:type="dxa"/>
-              <w:left w:w="100" w:type="dxa"/>
-              <w:bottom w:w="100" w:type="dxa"/>
-              <w:right w:w="100" w:type="dxa"/>
-            </w:tcMar>
-          </w:tcPr>
-          <w:p>
-            <w:pPr>
-              <w:widowControl w:val="0"/>
-              <w:spacing w:line="240" w:lineRule="auto"/>
-            </w:pPr>
-            <w:r>
-              <w:t>Tabla prestamos y detalle_prestamos</w:t>
-            </w:r>
+            <w:tcMar>
+              <w:top w:w="100" w:type="dxa"/>
+              <w:left w:w="100" w:type="dxa"/>
+              <w:bottom w:w="100" w:type="dxa"/>
+              <w:right w:w="100" w:type="dxa"/>
+            </w:tcMar>
+          </w:tcPr>
+          <w:p>
+            <w:pPr>
+              <w:widowControl w:val="0"/>
+              <w:spacing w:line="240" w:lineRule="auto"/>
+            </w:pPr>
+            <w:r>
+              <w:t xml:space="preserve">Tabla </w:t>
+            </w:r>
+            <w:proofErr w:type="spellStart"/>
+            <w:r>
+              <w:t>prestamos</w:t>
+            </w:r>
+            <w:proofErr w:type="spellEnd"/>
+            <w:r>
+              <w:t xml:space="preserve"> y </w:t>
+            </w:r>
+            <w:proofErr w:type="spellStart"/>
+            <w:r>
+              <w:t>detalle_prestamos</w:t>
+            </w:r>
+            <w:proofErr w:type="spellEnd"/>
           </w:p>
         </w:tc>
         <w:tc>
           <w:tcPr>
             <w:tcW w:w="1515" w:type="dxa"/>
-            <w:shd w:val="clear" w:color="auto" w:fill="auto"/>
             <w:tcMar>
               <w:top w:w="100" w:type="dxa"/>
               <w:left w:w="100" w:type="dxa"/>
@@ -7351,7 +7518,6 @@
         <w:tc>
           <w:tcPr>
             <w:tcW w:w="1965" w:type="dxa"/>
-            <w:shd w:val="clear" w:color="auto" w:fill="auto"/>
             <w:tcMar>
               <w:top w:w="100" w:type="dxa"/>
               <w:left w:w="100" w:type="dxa"/>
@@ -7387,7 +7553,6 @@
         <w:tc>
           <w:tcPr>
             <w:tcW w:w="2385" w:type="dxa"/>
-            <w:shd w:val="clear" w:color="auto" w:fill="auto"/>
             <w:tcMar>
               <w:top w:w="100" w:type="dxa"/>
               <w:left w:w="100" w:type="dxa"/>
@@ -7441,7 +7606,6 @@
           <w:tcPr>
             <w:tcW w:w="7515" w:type="dxa"/>
             <w:gridSpan w:val="4"/>
-            <w:shd w:val="clear" w:color="auto" w:fill="auto"/>
             <w:tcMar>
               <w:top w:w="100" w:type="dxa"/>
               <w:left w:w="100" w:type="dxa"/>
@@ -7506,7 +7670,6 @@
           <w:tcPr>
             <w:tcW w:w="7515" w:type="dxa"/>
             <w:gridSpan w:val="4"/>
-            <w:shd w:val="clear" w:color="auto" w:fill="auto"/>
             <w:tcMar>
               <w:top w:w="100" w:type="dxa"/>
               <w:left w:w="100" w:type="dxa"/>

</xml_diff>

<commit_message>
Docs: E-R Finalizado, diccionario de datos, RF actualizados
</commit_message>
<xml_diff>
--- a/docs/Requerimientos-Totales.docx
+++ b/docs/Requerimientos-Totales.docx
@@ -3026,12 +3026,7 @@
         <w:tab/>
       </w:r>
     </w:p>
-    <w:p>
-      <w:r>
-        <w:lastRenderedPageBreak/>
-        <w:br w:type="page"/>
-      </w:r>
-    </w:p>
+    <w:p/>
     <w:tbl>
       <w:tblPr>
         <w:tblStyle w:val="1"/>
@@ -3085,7 +3080,6 @@
               <w:rPr>
                 <w:b/>
               </w:rPr>
-              <w:lastRenderedPageBreak/>
               <w:t>Especificación de requerimientos</w:t>
             </w:r>
           </w:p>
@@ -5416,7 +5410,7 @@
               <w:spacing w:line="240" w:lineRule="auto"/>
             </w:pPr>
             <w:r>
-              <w:t>Fecha de nacimiento</w:t>
+              <w:t>Edad</w:t>
             </w:r>
           </w:p>
           <w:p>
@@ -10650,6 +10644,7 @@
   <w:style w:type="character" w:default="1" w:styleId="Fuentedeprrafopredeter">
     <w:name w:val="Default Paragraph Font"/>
     <w:uiPriority w:val="1"/>
+    <w:semiHidden/>
     <w:unhideWhenUsed/>
   </w:style>
   <w:style w:type="table" w:default="1" w:styleId="Tablanormal">

</xml_diff>